<commit_message>
refactor: change packages organization
</commit_message>
<xml_diff>
--- a/Modelo-Artigo.docx
+++ b/Modelo-Artigo.docx
@@ -1,29 +1,20 @@
 
 <file path=word/document.xml><?xml version="1.0" encoding="utf-8"?>
-<w:document xmlns:o="urn:schemas-microsoft-com:office:office" xmlns:r="http://schemas.openxmlformats.org/officeDocument/2006/relationships" xmlns:v="urn:schemas-microsoft-com:vml" xmlns:w="http://schemas.openxmlformats.org/wordprocessingml/2006/main" xmlns:w10="urn:schemas-microsoft-com:office:word" xmlns:wp="http://schemas.openxmlformats.org/drawingml/2006/wordprocessingDrawing" xmlns:wps="http://schemas.microsoft.com/office/word/2010/wordprocessingShape" xmlns:wpg="http://schemas.microsoft.com/office/word/2010/wordprocessingGroup" xmlns:mc="http://schemas.openxmlformats.org/markup-compatibility/2006" xmlns:wp14="http://schemas.microsoft.com/office/word/2010/wordprocessingDrawing" xmlns:w14="http://schemas.microsoft.com/office/word/2010/wordml" xmlns:w15="http://schemas.microsoft.com/office/word/2012/wordml" mc:Ignorable="w14 wp14 w15">
+<w:document xmlns:wpc="http://schemas.microsoft.com/office/word/2010/wordprocessingCanvas" xmlns:cx="http://schemas.microsoft.com/office/drawing/2014/chartex" xmlns:cx1="http://schemas.microsoft.com/office/drawing/2015/9/8/chartex" xmlns:cx2="http://schemas.microsoft.com/office/drawing/2015/10/21/chartex" xmlns:cx3="http://schemas.microsoft.com/office/drawing/2016/5/9/chartex" xmlns:cx4="http://schemas.microsoft.com/office/drawing/2016/5/10/chartex" xmlns:cx5="http://schemas.microsoft.com/office/drawing/2016/5/11/chartex" xmlns:cx6="http://schemas.microsoft.com/office/drawing/2016/5/12/chartex" xmlns:cx7="http://schemas.microsoft.com/office/drawing/2016/5/13/chartex" xmlns:cx8="http://schemas.microsoft.com/office/drawing/2016/5/14/chartex" xmlns:mc="http://schemas.openxmlformats.org/markup-compatibility/2006" xmlns:aink="http://schemas.microsoft.com/office/drawing/2016/ink" xmlns:am3d="http://schemas.microsoft.com/office/drawing/2017/model3d" xmlns:o="urn:schemas-microsoft-com:office:office" xmlns:oel="http://schemas.microsoft.com/office/2019/extlst" xmlns:r="http://schemas.openxmlformats.org/officeDocument/2006/relationships" xmlns:m="http://schemas.openxmlformats.org/officeDocument/2006/math" xmlns:v="urn:schemas-microsoft-com:vml" xmlns:wp14="http://schemas.microsoft.com/office/word/2010/wordprocessingDrawing" xmlns:wp="http://schemas.openxmlformats.org/drawingml/2006/wordprocessingDrawing" xmlns:w10="urn:schemas-microsoft-com:office:word" xmlns:w="http://schemas.openxmlformats.org/wordprocessingml/2006/main" xmlns:w14="http://schemas.microsoft.com/office/word/2010/wordml" xmlns:w15="http://schemas.microsoft.com/office/word/2012/wordml" xmlns:w16cex="http://schemas.microsoft.com/office/word/2018/wordml/cex" xmlns:w16cid="http://schemas.microsoft.com/office/word/2016/wordml/cid" xmlns:w16="http://schemas.microsoft.com/office/word/2018/wordml" xmlns:w16du="http://schemas.microsoft.com/office/word/2023/wordml/word16du" xmlns:w16sdtdh="http://schemas.microsoft.com/office/word/2020/wordml/sdtdatahash" xmlns:w16sdtfl="http://schemas.microsoft.com/office/word/2024/wordml/sdtformatlock" xmlns:w16se="http://schemas.microsoft.com/office/word/2015/wordml/symex" xmlns:wpg="http://schemas.microsoft.com/office/word/2010/wordprocessingGroup" xmlns:wpi="http://schemas.microsoft.com/office/word/2010/wordprocessingInk" xmlns:wne="http://schemas.microsoft.com/office/word/2006/wordml" xmlns:wps="http://schemas.microsoft.com/office/word/2010/wordprocessingShape" mc:Ignorable="w14 w15 w16se w16cid w16 w16cex w16sdtdh w16sdtfl w16du wp14">
   <w:background w:color="FFFFFF"/>
   <w:body>
     <w:tbl>
       <w:tblPr>
         <w:tblStyle w:val="Tabelacomgrade"/>
         <w:tblW w:w="9628" w:type="dxa"/>
-        <w:jc w:val="left"/>
-        <w:tblInd w:w="0" w:type="dxa"/>
         <w:tblLayout w:type="fixed"/>
-        <w:tblCellMar>
-          <w:top w:w="0" w:type="dxa"/>
-          <w:left w:w="108" w:type="dxa"/>
-          <w:bottom w:w="0" w:type="dxa"/>
-          <w:right w:w="108" w:type="dxa"/>
-        </w:tblCellMar>
-        <w:tblLook w:val="04a0" w:noHBand="0" w:noVBand="1" w:firstColumn="1" w:lastRow="0" w:lastColumn="0" w:firstRow="1"/>
+        <w:tblLook w:val="04A0" w:firstRow="1" w:lastRow="0" w:firstColumn="1" w:lastColumn="0" w:noHBand="0" w:noVBand="1"/>
       </w:tblPr>
       <w:tblGrid>
         <w:gridCol w:w="1980"/>
-        <w:gridCol w:w="7647"/>
+        <w:gridCol w:w="7648"/>
       </w:tblGrid>
       <w:tr>
-        <w:trPr/>
         <w:tc>
           <w:tcPr>
             <w:tcW w:w="1980" w:type="dxa"/>
@@ -37,25 +28,16 @@
           </w:tcPr>
           <w:p>
             <w:pPr>
-              <w:pStyle w:val="Normal"/>
-              <w:widowControl/>
-              <w:suppressAutoHyphens w:val="true"/>
-              <w:spacing w:before="0" w:after="0"/>
-              <w:jc w:val="left"/>
               <w:rPr>
                 <w:lang w:val="pt-BR" w:eastAsia="pt-BR"/>
               </w:rPr>
             </w:pPr>
             <w:r>
               <w:rPr>
-                <w:rFonts w:eastAsia="Times New Roman"/>
-                <w:kern w:val="0"/>
-                <w:sz w:val="20"/>
-                <w:szCs w:val="20"/>
-                <w:lang w:bidi="ar-SA"/>
+                <w:noProof/>
               </w:rPr>
               <w:drawing>
-                <wp:inline distT="0" distB="0" distL="0" distR="0">
+                <wp:inline distT="0" distB="0" distL="0" distR="0" wp14:anchorId="491463C5" wp14:editId="2E4450A3">
                   <wp:extent cx="1076960" cy="457200"/>
                   <wp:effectExtent l="0" t="0" r="0" b="0"/>
                   <wp:docPr id="1" name="Imagem 1" descr="Unifor | Universidade de Fortaleza"/>
@@ -72,7 +54,7 @@
                           </pic:cNvPicPr>
                         </pic:nvPicPr>
                         <pic:blipFill>
-                          <a:blip r:embed="rId2"/>
+                          <a:blip r:embed="rId5"/>
                           <a:stretch>
                             <a:fillRect/>
                           </a:stretch>
@@ -107,48 +89,40 @@
           </w:tcPr>
           <w:p>
             <w:pPr>
-              <w:pStyle w:val="Normal"/>
-              <w:widowControl/>
-              <w:suppressAutoHyphens w:val="true"/>
-              <w:spacing w:before="0" w:after="0"/>
-              <w:jc w:val="left"/>
               <w:rPr>
                 <w:lang w:val="pt-BR" w:eastAsia="pt-BR"/>
               </w:rPr>
             </w:pPr>
             <w:r>
               <w:rPr>
-                <w:rFonts w:eastAsia="Times New Roman"/>
-                <w:kern w:val="0"/>
-                <w:sz w:val="20"/>
-                <w:szCs w:val="20"/>
-                <w:lang w:val="pt-BR" w:eastAsia="pt-BR" w:bidi="ar-SA"/>
+                <w:lang w:val="pt-BR" w:eastAsia="pt-BR"/>
               </w:rPr>
               <w:t>UNIVERSIDADE DE FORTALEZA</w:t>
             </w:r>
           </w:p>
           <w:p>
             <w:pPr>
-              <w:pStyle w:val="Normal"/>
-              <w:widowControl/>
-              <w:suppressAutoHyphens w:val="true"/>
-              <w:spacing w:before="0" w:after="0"/>
-              <w:jc w:val="left"/>
               <w:rPr>
                 <w:lang w:val="pt-BR" w:eastAsia="pt-BR"/>
               </w:rPr>
             </w:pPr>
             <w:r>
               <w:rPr>
-                <w:rFonts w:eastAsia="Times New Roman"/>
-                <w:kern w:val="0"/>
-                <w:sz w:val="20"/>
-                <w:szCs w:val="20"/>
-                <w:lang w:val="pt-BR" w:eastAsia="pt-BR" w:bidi="ar-SA"/>
+                <w:lang w:val="pt-BR" w:eastAsia="pt-BR"/>
               </w:rPr>
               <w:t>CENTRO DE CIÊNCIAS TECNOLÓGICAS</w:t>
+            </w:r>
+            <w:r>
+              <w:rPr>
+                <w:lang w:val="pt-BR" w:eastAsia="pt-BR"/>
+              </w:rPr>
               <w:br/>
               <w:t>CURSO: CIÊNCIA DA COMPUTAÇÃO</w:t>
+            </w:r>
+            <w:r>
+              <w:rPr>
+                <w:lang w:val="pt-BR" w:eastAsia="pt-BR"/>
+              </w:rPr>
               <w:br/>
             </w:r>
           </w:p>
@@ -157,38 +131,25 @@
     </w:tbl>
     <w:p>
       <w:pPr>
-        <w:pStyle w:val="Normal"/>
         <w:rPr>
           <w:lang w:val="pt-BR" w:eastAsia="pt-BR"/>
         </w:rPr>
       </w:pPr>
-      <w:r>
-        <w:rPr>
-          <w:lang w:val="pt-BR" w:eastAsia="pt-BR"/>
-        </w:rPr>
-      </w:r>
     </w:p>
     <w:p>
       <w:pPr>
-        <w:pStyle w:val="Normal"/>
         <w:rPr>
           <w:lang w:val="pt-BR"/>
         </w:rPr>
       </w:pPr>
-      <w:r>
-        <w:rPr>
-          <w:lang w:val="pt-BR"/>
-        </w:rPr>
-      </w:r>
     </w:p>
     <w:p>
       <w:pPr>
         <w:pStyle w:val="TAMainText"/>
-        <w:ind w:hanging="0"/>
+        <w:ind w:firstLine="0"/>
         <w:jc w:val="center"/>
         <w:rPr>
           <w:rFonts w:ascii="Arial" w:hAnsi="Arial" w:cs="Arial"/>
-          <w:i/>
           <w:i/>
           <w:iCs/>
           <w:sz w:val="28"/>
@@ -198,34 +159,22 @@
       </w:pPr>
       <w:r>
         <w:rPr>
-          <w:rFonts w:cs="Arial" w:ascii="Arial" w:hAnsi="Arial"/>
+          <w:rFonts w:ascii="Arial" w:hAnsi="Arial" w:cs="Arial"/>
           <w:i/>
           <w:iCs/>
           <w:sz w:val="28"/>
           <w:szCs w:val="28"/>
           <w:lang w:val="pt-BR"/>
         </w:rPr>
-        <w:t>Análise de Algoritmos de Busca Cega e Busca Orientada aplicadas a resolução de problemas em Grafos na linguagem Java</w:t>
-      </w:r>
-      <w:r>
-        <w:rPr>
-          <w:rFonts w:cs="Arial" w:ascii="Arial" w:hAnsi="Arial"/>
-          <w:i/>
-          <w:iCs/>
-          <w:sz w:val="28"/>
-          <w:szCs w:val="28"/>
-          <w:lang w:val="pt-BR"/>
-        </w:rPr>
-        <w:t>.</w:t>
+        <w:t>Análise de Algoritmos de Busca Cega e Busca Orientada aplicadas a resolução de problemas em Grafos na linguagem Java.</w:t>
       </w:r>
     </w:p>
     <w:p>
       <w:pPr>
         <w:pStyle w:val="TAMainText"/>
-        <w:ind w:hanging="0"/>
-        <w:rPr>
-          <w:rFonts w:ascii="Arial" w:hAnsi="Arial" w:cs="Arial"/>
-          <w:i/>
+        <w:ind w:firstLine="0"/>
+        <w:rPr>
+          <w:rFonts w:ascii="Arial" w:hAnsi="Arial" w:cs="Arial"/>
           <w:i/>
           <w:iCs/>
           <w:lang w:val="pt-BR"/>
@@ -233,40 +182,21 @@
       </w:pPr>
       <w:r>
         <w:rPr>
-          <w:rFonts w:cs="Arial" w:ascii="Arial" w:hAnsi="Arial"/>
+          <w:rFonts w:ascii="Arial" w:hAnsi="Arial" w:cs="Arial"/>
           <w:i/>
           <w:iCs/>
           <w:lang w:val="pt-BR"/>
         </w:rPr>
         <w:br/>
-        <w:t xml:space="preserve">Autor 1: </w:t>
-      </w:r>
-      <w:r>
-        <w:rPr>
-          <w:rFonts w:cs="Arial" w:ascii="Arial" w:hAnsi="Arial"/>
-          <w:i/>
-          <w:iCs/>
-          <w:lang w:val="pt-BR"/>
-        </w:rPr>
-        <w:t>Luiz Eduardo Alves Camurça</w:t>
-      </w:r>
-      <w:r>
-        <w:rPr>
-          <w:rFonts w:cs="Arial" w:ascii="Arial" w:hAnsi="Arial"/>
-          <w:i/>
-          <w:iCs/>
-          <w:lang w:val="pt-BR"/>
-        </w:rPr>
-        <w:t>.</w:t>
+        <w:t>Autor 1: Luiz Eduardo Alves Camurça.</w:t>
       </w:r>
     </w:p>
     <w:p>
       <w:pPr>
         <w:pStyle w:val="TAMainText"/>
-        <w:ind w:hanging="0"/>
-        <w:rPr>
-          <w:rFonts w:ascii="Arial" w:hAnsi="Arial" w:cs="Arial"/>
-          <w:i/>
+        <w:ind w:firstLine="0"/>
+        <w:rPr>
+          <w:rFonts w:ascii="Arial" w:hAnsi="Arial" w:cs="Arial"/>
           <w:i/>
           <w:iCs/>
           <w:sz w:val="22"/>
@@ -274,54 +204,35 @@
           <w:lang w:val="pt-BR"/>
         </w:rPr>
       </w:pPr>
-      <w:r>
-        <w:rPr>
-          <w:rFonts w:cs="Arial" w:ascii="Arial" w:hAnsi="Arial"/>
-          <w:i/>
-          <w:iCs/>
-          <w:sz w:val="22"/>
-          <w:szCs w:val="22"/>
-          <w:lang w:val="pt-BR"/>
-        </w:rPr>
-      </w:r>
     </w:p>
     <w:p>
       <w:pPr>
         <w:pStyle w:val="NormalWeb"/>
         <w:spacing w:before="280" w:after="0"/>
-        <w:rPr/>
       </w:pPr>
       <w:bookmarkStart w:id="0" w:name="Texto3"/>
       <w:bookmarkEnd w:id="0"/>
       <w:r>
         <w:rPr>
-          <w:rFonts w:cs="Arial" w:ascii="Arial" w:hAnsi="Arial"/>
+          <w:rFonts w:ascii="Arial" w:hAnsi="Arial" w:cs="Arial"/>
           <w:iCs/>
           <w:sz w:val="18"/>
           <w:szCs w:val="18"/>
         </w:rPr>
-        <w:t xml:space="preserve">Palavras-chave: </w:t>
-      </w:r>
-      <w:r>
-        <w:rPr>
-          <w:rFonts w:cs="Arial" w:ascii="Arial" w:hAnsi="Arial"/>
-          <w:iCs/>
-          <w:sz w:val="18"/>
-          <w:szCs w:val="18"/>
-        </w:rPr>
-        <w:t>Busca Cega. Busca Orientada. Java. Algoritmos. Grafos.</w:t>
+        <w:t>Palavras-chave: Busca Cega. Busca Orientada. Java. Algoritmos. Grafos.</w:t>
       </w:r>
     </w:p>
     <w:p>
       <w:pPr>
+        <w:rPr>
+          <w:lang w:val="pt-BR"/>
+        </w:rPr>
         <w:sectPr>
-          <w:type w:val="nextPage"/>
           <w:pgSz w:w="11906" w:h="16838"/>
-          <w:pgMar w:left="1134" w:right="1134" w:gutter="0" w:header="0" w:top="709" w:footer="0" w:bottom="1134"/>
-          <w:pgNumType w:fmt="decimal"/>
-          <w:formProt w:val="false"/>
-          <w:textDirection w:val="lrTb"/>
-          <w:docGrid w:type="default" w:linePitch="360" w:charSpace="16384"/>
+          <w:pgMar w:top="709" w:right="1134" w:bottom="1134" w:left="1134" w:header="0" w:footer="0" w:gutter="0"/>
+          <w:cols w:space="720"/>
+          <w:formProt w:val="0"/>
+          <w:docGrid w:linePitch="360" w:charSpace="16384"/>
         </w:sectPr>
       </w:pPr>
     </w:p>
@@ -334,13 +245,13 @@
           <w:bottom w:val="single" w:sz="4" w:space="0" w:color="000000"/>
           <w:right w:val="single" w:sz="4" w:space="4" w:color="000000"/>
         </w:pBdr>
-        <w:shd w:val="clear" w:color="auto" w:fill="D9D9D9" w:themeFill="background1" w:themeFillShade="d9"/>
-        <w:spacing w:before="200" w:after="120"/>
-        <w:ind w:left="85" w:right="130"/>
+        <w:shd w:val="clear" w:color="auto" w:fill="D9D9D9" w:themeFill="background1" w:themeFillShade="D9"/>
+        <w:spacing w:after="120"/>
+        <w:ind w:left="85"/>
         <w:jc w:val="left"/>
         <w:rPr>
           <w:rFonts w:ascii="Arial" w:hAnsi="Arial" w:cs="Arial"/>
-          <w:color w:themeColor="text1" w:val="000000"/>
+          <w:color w:val="000000" w:themeColor="text1"/>
           <w:sz w:val="24"/>
           <w:szCs w:val="24"/>
           <w:lang w:val="pt-BR"/>
@@ -348,8 +259,8 @@
       </w:pPr>
       <w:r>
         <w:rPr>
-          <w:rFonts w:cs="Arial" w:ascii="Arial" w:hAnsi="Arial"/>
-          <w:color w:themeColor="text1" w:val="000000"/>
+          <w:rFonts w:ascii="Arial" w:hAnsi="Arial" w:cs="Arial"/>
+          <w:color w:val="000000" w:themeColor="text1"/>
           <w:sz w:val="24"/>
           <w:szCs w:val="24"/>
           <w:lang w:val="pt-BR"/>
@@ -359,20 +270,23 @@
     </w:p>
     <w:p>
       <w:pPr>
+        <w:rPr>
+          <w:lang w:val="pt-BR"/>
+        </w:rPr>
         <w:sectPr>
           <w:type w:val="continuous"/>
           <w:pgSz w:w="11906" w:h="16838"/>
-          <w:pgMar w:left="1134" w:right="1134" w:gutter="0" w:header="0" w:top="709" w:footer="0" w:bottom="1134"/>
-          <w:formProt w:val="false"/>
-          <w:textDirection w:val="lrTb"/>
-          <w:docGrid w:type="default" w:linePitch="360" w:charSpace="16384"/>
+          <w:pgMar w:top="709" w:right="1134" w:bottom="1134" w:left="1134" w:header="0" w:footer="0" w:gutter="0"/>
+          <w:cols w:space="720"/>
+          <w:formProt w:val="0"/>
+          <w:docGrid w:linePitch="360" w:charSpace="16384"/>
         </w:sectPr>
       </w:pPr>
     </w:p>
     <w:p>
       <w:pPr>
         <w:pStyle w:val="TAMainText"/>
-        <w:ind w:hanging="0" w:left="86" w:right="130"/>
+        <w:ind w:left="86" w:right="130" w:firstLine="0"/>
         <w:rPr>
           <w:rFonts w:ascii="Arial" w:hAnsi="Arial" w:cs="Arial"/>
           <w:lang w:val="pt-BR"/>
@@ -380,43 +294,223 @@
       </w:pPr>
       <w:r>
         <w:rPr>
-          <w:rFonts w:cs="Arial" w:ascii="Arial" w:hAnsi="Arial"/>
-          <w:sz w:val="22"/>
-          <w:szCs w:val="22"/>
-          <w:lang w:val="pt-BR" w:eastAsia="ar-SA"/>
-        </w:rPr>
-        <w:t xml:space="preserve">Neste trabalho, foram implementados algoritmos de busca cega e busca orientada no contexto de grafos. Foram eles: Busca em Largura(Bfs), Busca em Profundidade(Dfs), Busca por Melhor Escolha, Busca Gulosa, Busca A*, Algoritmo de Dijkstra e Busca de Custo Uniforme (Ucs). Os algoritmos de Busca Cega (Bfs, Dfs, Dijsktra e Ucs) não possuem conhecimento sobre onde está a solução, tomando decisões baseando-se apenas na estrutura do problema (estado inicial, operadores, testes de objetivo e custo acumulado), enquanto os de Busca Orientada – ou Busca Heurística – </w:t>
-      </w:r>
-      <w:r>
-        <w:rPr>
-          <w:rFonts w:cs="Arial" w:ascii="Arial" w:hAnsi="Arial"/>
-          <w:sz w:val="22"/>
-          <w:szCs w:val="22"/>
-          <w:lang w:val="pt-BR" w:eastAsia="ar-SA"/>
-        </w:rPr>
-        <w:t xml:space="preserve">(Gulosa, Best-first, A*) </w:t>
-      </w:r>
-      <w:r>
-        <w:rPr>
-          <w:rFonts w:cs="Arial" w:ascii="Arial" w:hAnsi="Arial"/>
-          <w:sz w:val="22"/>
-          <w:szCs w:val="22"/>
-          <w:lang w:val="pt-BR" w:eastAsia="ar-SA"/>
-        </w:rPr>
-        <w:t>o algoritmo possui informação adicional (heurística), tendo as escolhas guiadas por essa informação. Um exemplo possível seria: Para buscar uma sala específica em um prédio, a busca cega percorreria todas as salas de todos os andares, enquanto a busca guiada iria procurar primeiro nos andares em que a sala tem maior probabilidade de esta</w:t>
-      </w:r>
-      <w:r>
-        <w:rPr>
-          <w:rFonts w:cs="Arial" w:ascii="Arial" w:hAnsi="Arial"/>
-          <w:sz w:val="22"/>
-          <w:szCs w:val="22"/>
-          <w:lang w:val="pt-BR" w:eastAsia="ar-SA"/>
-        </w:rPr>
-        <w:t>r.</w:t>
-      </w:r>
-      <w:r>
-        <w:rPr>
-          <w:rFonts w:cs="Arial" w:ascii="Arial" w:hAnsi="Arial"/>
+          <w:rFonts w:ascii="Arial" w:hAnsi="Arial" w:cs="Arial"/>
+          <w:sz w:val="22"/>
+          <w:szCs w:val="22"/>
+          <w:lang w:val="pt-BR"/>
+        </w:rPr>
+        <w:t xml:space="preserve">Neste trabalho, foram implementados algoritmos de busca cega e busca orientada no contexto de grafos. Foram eles: Busca em </w:t>
+      </w:r>
+      <w:r>
+        <w:rPr>
+          <w:rFonts w:ascii="Arial" w:hAnsi="Arial" w:cs="Arial"/>
+          <w:sz w:val="22"/>
+          <w:szCs w:val="22"/>
+          <w:lang w:val="pt-BR"/>
+        </w:rPr>
+        <w:t>Largura (</w:t>
+      </w:r>
+      <w:proofErr w:type="spellStart"/>
+      <w:r>
+        <w:rPr>
+          <w:rFonts w:ascii="Arial" w:hAnsi="Arial" w:cs="Arial"/>
+          <w:sz w:val="22"/>
+          <w:szCs w:val="22"/>
+          <w:lang w:val="pt-BR"/>
+        </w:rPr>
+        <w:t>Bfs</w:t>
+      </w:r>
+      <w:proofErr w:type="spellEnd"/>
+      <w:r>
+        <w:rPr>
+          <w:rFonts w:ascii="Arial" w:hAnsi="Arial" w:cs="Arial"/>
+          <w:sz w:val="22"/>
+          <w:szCs w:val="22"/>
+          <w:lang w:val="pt-BR"/>
+        </w:rPr>
+        <w:t>), Busca em Profundidade</w:t>
+      </w:r>
+      <w:r>
+        <w:rPr>
+          <w:rFonts w:ascii="Arial" w:hAnsi="Arial" w:cs="Arial"/>
+          <w:sz w:val="22"/>
+          <w:szCs w:val="22"/>
+          <w:lang w:val="pt-BR"/>
+        </w:rPr>
+        <w:t xml:space="preserve"> </w:t>
+      </w:r>
+      <w:r>
+        <w:rPr>
+          <w:rFonts w:ascii="Arial" w:hAnsi="Arial" w:cs="Arial"/>
+          <w:sz w:val="22"/>
+          <w:szCs w:val="22"/>
+          <w:lang w:val="pt-BR"/>
+        </w:rPr>
+        <w:t>(</w:t>
+      </w:r>
+      <w:proofErr w:type="spellStart"/>
+      <w:r>
+        <w:rPr>
+          <w:rFonts w:ascii="Arial" w:hAnsi="Arial" w:cs="Arial"/>
+          <w:sz w:val="22"/>
+          <w:szCs w:val="22"/>
+          <w:lang w:val="pt-BR"/>
+        </w:rPr>
+        <w:t>Dfs</w:t>
+      </w:r>
+      <w:proofErr w:type="spellEnd"/>
+      <w:r>
+        <w:rPr>
+          <w:rFonts w:ascii="Arial" w:hAnsi="Arial" w:cs="Arial"/>
+          <w:sz w:val="22"/>
+          <w:szCs w:val="22"/>
+          <w:lang w:val="pt-BR"/>
+        </w:rPr>
+        <w:t xml:space="preserve">), Busca por Melhor Escolha, Busca Gulosa, Busca A*, Algoritmo de </w:t>
+      </w:r>
+      <w:proofErr w:type="spellStart"/>
+      <w:r>
+        <w:rPr>
+          <w:rFonts w:ascii="Arial" w:hAnsi="Arial" w:cs="Arial"/>
+          <w:sz w:val="22"/>
+          <w:szCs w:val="22"/>
+          <w:lang w:val="pt-BR"/>
+        </w:rPr>
+        <w:t>Dijkstra</w:t>
+      </w:r>
+      <w:proofErr w:type="spellEnd"/>
+      <w:r>
+        <w:rPr>
+          <w:rFonts w:ascii="Arial" w:hAnsi="Arial" w:cs="Arial"/>
+          <w:sz w:val="22"/>
+          <w:szCs w:val="22"/>
+          <w:lang w:val="pt-BR"/>
+        </w:rPr>
+        <w:t xml:space="preserve"> e Busca de Custo Uniforme (</w:t>
+      </w:r>
+      <w:proofErr w:type="spellStart"/>
+      <w:r>
+        <w:rPr>
+          <w:rFonts w:ascii="Arial" w:hAnsi="Arial" w:cs="Arial"/>
+          <w:sz w:val="22"/>
+          <w:szCs w:val="22"/>
+          <w:lang w:val="pt-BR"/>
+        </w:rPr>
+        <w:t>Ucs</w:t>
+      </w:r>
+      <w:proofErr w:type="spellEnd"/>
+      <w:r>
+        <w:rPr>
+          <w:rFonts w:ascii="Arial" w:hAnsi="Arial" w:cs="Arial"/>
+          <w:sz w:val="22"/>
+          <w:szCs w:val="22"/>
+          <w:lang w:val="pt-BR"/>
+        </w:rPr>
+        <w:t>). Os algoritmos de Busca Cega (</w:t>
+      </w:r>
+      <w:proofErr w:type="spellStart"/>
+      <w:r>
+        <w:rPr>
+          <w:rFonts w:ascii="Arial" w:hAnsi="Arial" w:cs="Arial"/>
+          <w:sz w:val="22"/>
+          <w:szCs w:val="22"/>
+          <w:lang w:val="pt-BR"/>
+        </w:rPr>
+        <w:t>Bfs</w:t>
+      </w:r>
+      <w:proofErr w:type="spellEnd"/>
+      <w:r>
+        <w:rPr>
+          <w:rFonts w:ascii="Arial" w:hAnsi="Arial" w:cs="Arial"/>
+          <w:sz w:val="22"/>
+          <w:szCs w:val="22"/>
+          <w:lang w:val="pt-BR"/>
+        </w:rPr>
+        <w:t xml:space="preserve">, </w:t>
+      </w:r>
+      <w:proofErr w:type="spellStart"/>
+      <w:r>
+        <w:rPr>
+          <w:rFonts w:ascii="Arial" w:hAnsi="Arial" w:cs="Arial"/>
+          <w:sz w:val="22"/>
+          <w:szCs w:val="22"/>
+          <w:lang w:val="pt-BR"/>
+        </w:rPr>
+        <w:t>Dfs</w:t>
+      </w:r>
+      <w:proofErr w:type="spellEnd"/>
+      <w:r>
+        <w:rPr>
+          <w:rFonts w:ascii="Arial" w:hAnsi="Arial" w:cs="Arial"/>
+          <w:sz w:val="22"/>
+          <w:szCs w:val="22"/>
+          <w:lang w:val="pt-BR"/>
+        </w:rPr>
+        <w:t xml:space="preserve">, </w:t>
+      </w:r>
+      <w:proofErr w:type="spellStart"/>
+      <w:r>
+        <w:rPr>
+          <w:rFonts w:ascii="Arial" w:hAnsi="Arial" w:cs="Arial"/>
+          <w:sz w:val="22"/>
+          <w:szCs w:val="22"/>
+          <w:lang w:val="pt-BR"/>
+        </w:rPr>
+        <w:t>Dijsktra</w:t>
+      </w:r>
+      <w:proofErr w:type="spellEnd"/>
+      <w:r>
+        <w:rPr>
+          <w:rFonts w:ascii="Arial" w:hAnsi="Arial" w:cs="Arial"/>
+          <w:sz w:val="22"/>
+          <w:szCs w:val="22"/>
+          <w:lang w:val="pt-BR"/>
+        </w:rPr>
+        <w:t xml:space="preserve"> e </w:t>
+      </w:r>
+      <w:proofErr w:type="spellStart"/>
+      <w:r>
+        <w:rPr>
+          <w:rFonts w:ascii="Arial" w:hAnsi="Arial" w:cs="Arial"/>
+          <w:sz w:val="22"/>
+          <w:szCs w:val="22"/>
+          <w:lang w:val="pt-BR"/>
+        </w:rPr>
+        <w:t>Ucs</w:t>
+      </w:r>
+      <w:proofErr w:type="spellEnd"/>
+      <w:r>
+        <w:rPr>
+          <w:rFonts w:ascii="Arial" w:hAnsi="Arial" w:cs="Arial"/>
+          <w:sz w:val="22"/>
+          <w:szCs w:val="22"/>
+          <w:lang w:val="pt-BR"/>
+        </w:rPr>
+        <w:t>) não possuem conhecimento sobre onde está a solução, tomando decisões baseando-se apenas na estrutura do problema (estado inicial, operadores, testes de objetivo e custo acumulado), enquanto os de Busca Orientada – ou Busca Heurística – (Gulosa, Best-</w:t>
+      </w:r>
+      <w:proofErr w:type="spellStart"/>
+      <w:r>
+        <w:rPr>
+          <w:rFonts w:ascii="Arial" w:hAnsi="Arial" w:cs="Arial"/>
+          <w:sz w:val="22"/>
+          <w:szCs w:val="22"/>
+          <w:lang w:val="pt-BR"/>
+        </w:rPr>
+        <w:t>first</w:t>
+      </w:r>
+      <w:proofErr w:type="spellEnd"/>
+      <w:r>
+        <w:rPr>
+          <w:rFonts w:ascii="Arial" w:hAnsi="Arial" w:cs="Arial"/>
+          <w:sz w:val="22"/>
+          <w:szCs w:val="22"/>
+          <w:lang w:val="pt-BR"/>
+        </w:rPr>
+        <w:t>, A*) o algoritmo possui informação adicional (heurística), tendo as escolhas guiadas por essa informação. Um exemplo possível seria: Para buscar uma sala específica em um prédio, a busca cega percorreria todas as salas de todos os andares, enquanto a busca guiada iria procurar primeiro nos andares em que a sala tem maior probabilidade de estar.</w:t>
+      </w:r>
+      <w:r>
+        <w:rPr>
+          <w:rFonts w:ascii="Arial" w:hAnsi="Arial" w:cs="Arial"/>
           <w:lang w:val="pt-BR"/>
         </w:rPr>
         <w:t xml:space="preserve">   </w:t>
@@ -424,13 +518,16 @@
     </w:p>
     <w:p>
       <w:pPr>
+        <w:rPr>
+          <w:lang w:val="pt-BR"/>
+        </w:rPr>
         <w:sectPr>
           <w:type w:val="continuous"/>
           <w:pgSz w:w="11906" w:h="16838"/>
-          <w:pgMar w:left="1134" w:right="1134" w:gutter="0" w:header="0" w:top="709" w:footer="0" w:bottom="1134"/>
-          <w:formProt w:val="false"/>
-          <w:textDirection w:val="lrTb"/>
-          <w:docGrid w:type="default" w:linePitch="360" w:charSpace="16384"/>
+          <w:pgMar w:top="709" w:right="1134" w:bottom="1134" w:left="1134" w:header="0" w:footer="0" w:gutter="0"/>
+          <w:cols w:space="720"/>
+          <w:formProt w:val="0"/>
+          <w:docGrid w:linePitch="360" w:charSpace="16384"/>
         </w:sectPr>
       </w:pPr>
     </w:p>
@@ -443,13 +540,13 @@
           <w:bottom w:val="single" w:sz="4" w:space="0" w:color="000000"/>
           <w:right w:val="single" w:sz="4" w:space="4" w:color="000000"/>
         </w:pBdr>
-        <w:shd w:val="clear" w:color="auto" w:fill="D9D9D9" w:themeFill="background1" w:themeFillShade="d9"/>
-        <w:spacing w:before="200" w:after="120"/>
-        <w:ind w:left="85" w:right="130"/>
+        <w:shd w:val="clear" w:color="auto" w:fill="D9D9D9" w:themeFill="background1" w:themeFillShade="D9"/>
+        <w:spacing w:after="120"/>
+        <w:ind w:left="85"/>
         <w:jc w:val="left"/>
         <w:rPr>
           <w:rFonts w:ascii="Arial" w:hAnsi="Arial" w:cs="Arial"/>
-          <w:color w:themeColor="text1" w:val="000000"/>
+          <w:color w:val="000000" w:themeColor="text1"/>
           <w:sz w:val="24"/>
           <w:szCs w:val="24"/>
           <w:lang w:val="pt-BR"/>
@@ -457,8 +554,8 @@
       </w:pPr>
       <w:r>
         <w:rPr>
-          <w:rFonts w:cs="Arial" w:ascii="Arial" w:hAnsi="Arial"/>
-          <w:color w:themeColor="text1" w:val="000000"/>
+          <w:rFonts w:ascii="Arial" w:hAnsi="Arial" w:cs="Arial"/>
+          <w:color w:val="000000" w:themeColor="text1"/>
           <w:sz w:val="24"/>
           <w:szCs w:val="24"/>
           <w:lang w:val="pt-BR"/>
@@ -468,20 +565,23 @@
     </w:p>
     <w:p>
       <w:pPr>
+        <w:rPr>
+          <w:lang w:val="pt-BR"/>
+        </w:rPr>
         <w:sectPr>
           <w:type w:val="continuous"/>
           <w:pgSz w:w="11906" w:h="16838"/>
-          <w:pgMar w:left="1134" w:right="1134" w:gutter="0" w:header="0" w:top="709" w:footer="0" w:bottom="1134"/>
-          <w:formProt w:val="false"/>
-          <w:textDirection w:val="lrTb"/>
-          <w:docGrid w:type="default" w:linePitch="360" w:charSpace="16384"/>
+          <w:pgMar w:top="709" w:right="1134" w:bottom="1134" w:left="1134" w:header="0" w:footer="0" w:gutter="0"/>
+          <w:cols w:space="720"/>
+          <w:formProt w:val="0"/>
+          <w:docGrid w:linePitch="360" w:charSpace="16384"/>
         </w:sectPr>
       </w:pPr>
     </w:p>
     <w:p>
       <w:pPr>
         <w:pStyle w:val="TAMainText"/>
-        <w:ind w:hanging="0" w:left="86" w:right="130"/>
+        <w:ind w:left="86" w:right="130" w:firstLine="0"/>
         <w:rPr>
           <w:rFonts w:ascii="Arial" w:hAnsi="Arial" w:cs="Arial"/>
           <w:sz w:val="22"/>
@@ -491,12 +591,92 @@
       </w:pPr>
       <w:r>
         <w:rPr>
-          <w:rFonts w:cs="Arial" w:ascii="Arial" w:hAnsi="Arial"/>
-          <w:sz w:val="22"/>
-          <w:szCs w:val="22"/>
-          <w:lang w:val="pt-BR"/>
-        </w:rPr>
-        <w:t>Em sua implementação, o trabalho foi dividido em 3 pacotes, sendo Grafos referente a implementação da classe Graph e suas classes auxiliares, utilizada como entrada para os algoritmos de ordenação. A classe Graph utiliza uma matriz de adjacência para representar o grafo. Outra parte é referente aos algoritmos propriamente ditos, sendo todos eles implementados na classe SearchingAlgorithms. Os algoritmos são chamados dentro da classe Main, que importa também a terceira parte do código, que é responsável por realizar e armazenar o benchmarking das buscas.</w:t>
+          <w:rFonts w:ascii="Arial" w:hAnsi="Arial" w:cs="Arial"/>
+          <w:sz w:val="22"/>
+          <w:szCs w:val="22"/>
+          <w:lang w:val="pt-BR"/>
+        </w:rPr>
+        <w:t xml:space="preserve">Em sua implementação, o trabalho foi dividido em 3 pacotes, sendo Grafos referente a implementação da classe </w:t>
+      </w:r>
+      <w:proofErr w:type="spellStart"/>
+      <w:r>
+        <w:rPr>
+          <w:rFonts w:ascii="Arial" w:hAnsi="Arial" w:cs="Arial"/>
+          <w:sz w:val="22"/>
+          <w:szCs w:val="22"/>
+          <w:lang w:val="pt-BR"/>
+        </w:rPr>
+        <w:t>Graph</w:t>
+      </w:r>
+      <w:proofErr w:type="spellEnd"/>
+      <w:r>
+        <w:rPr>
+          <w:rFonts w:ascii="Arial" w:hAnsi="Arial" w:cs="Arial"/>
+          <w:sz w:val="22"/>
+          <w:szCs w:val="22"/>
+          <w:lang w:val="pt-BR"/>
+        </w:rPr>
+        <w:t xml:space="preserve"> e suas classes auxiliares, utilizada como entrada para os algoritmos de ordenação. A classe </w:t>
+      </w:r>
+      <w:proofErr w:type="spellStart"/>
+      <w:r>
+        <w:rPr>
+          <w:rFonts w:ascii="Arial" w:hAnsi="Arial" w:cs="Arial"/>
+          <w:sz w:val="22"/>
+          <w:szCs w:val="22"/>
+          <w:lang w:val="pt-BR"/>
+        </w:rPr>
+        <w:t>Graph</w:t>
+      </w:r>
+      <w:proofErr w:type="spellEnd"/>
+      <w:r>
+        <w:rPr>
+          <w:rFonts w:ascii="Arial" w:hAnsi="Arial" w:cs="Arial"/>
+          <w:sz w:val="22"/>
+          <w:szCs w:val="22"/>
+          <w:lang w:val="pt-BR"/>
+        </w:rPr>
+        <w:t xml:space="preserve"> utiliza uma matriz de adjacência para representar o grafo. Outra parte é referente aos algoritmos propriamente ditos, sendo todos eles implementados na classe </w:t>
+      </w:r>
+      <w:proofErr w:type="spellStart"/>
+      <w:r>
+        <w:rPr>
+          <w:rFonts w:ascii="Arial" w:hAnsi="Arial" w:cs="Arial"/>
+          <w:sz w:val="22"/>
+          <w:szCs w:val="22"/>
+          <w:lang w:val="pt-BR"/>
+        </w:rPr>
+        <w:t>SearchingAlgorithms</w:t>
+      </w:r>
+      <w:proofErr w:type="spellEnd"/>
+      <w:r>
+        <w:rPr>
+          <w:rFonts w:ascii="Arial" w:hAnsi="Arial" w:cs="Arial"/>
+          <w:sz w:val="22"/>
+          <w:szCs w:val="22"/>
+          <w:lang w:val="pt-BR"/>
+        </w:rPr>
+        <w:t xml:space="preserve">. Os algoritmos são chamados dentro da classe </w:t>
+      </w:r>
+      <w:proofErr w:type="spellStart"/>
+      <w:r>
+        <w:rPr>
+          <w:rFonts w:ascii="Arial" w:hAnsi="Arial" w:cs="Arial"/>
+          <w:sz w:val="22"/>
+          <w:szCs w:val="22"/>
+          <w:lang w:val="pt-BR"/>
+        </w:rPr>
+        <w:t>Main</w:t>
+      </w:r>
+      <w:proofErr w:type="spellEnd"/>
+      <w:r>
+        <w:rPr>
+          <w:rFonts w:ascii="Arial" w:hAnsi="Arial" w:cs="Arial"/>
+          <w:sz w:val="22"/>
+          <w:szCs w:val="22"/>
+          <w:lang w:val="pt-BR"/>
+        </w:rPr>
+        <w:t>, que importa também a terceira parte do código, que é responsável por realizar e armazenar o benchmarking das buscas.</w:t>
       </w:r>
     </w:p>
     <w:p>
@@ -508,13 +688,13 @@
           <w:bottom w:val="single" w:sz="4" w:space="0" w:color="000000"/>
           <w:right w:val="single" w:sz="4" w:space="4" w:color="000000"/>
         </w:pBdr>
-        <w:shd w:val="clear" w:color="auto" w:fill="D9D9D9" w:themeFill="background1" w:themeFillShade="d9"/>
-        <w:spacing w:before="200" w:after="120"/>
-        <w:ind w:left="85" w:right="130"/>
+        <w:shd w:val="clear" w:color="auto" w:fill="D9D9D9" w:themeFill="background1" w:themeFillShade="D9"/>
+        <w:spacing w:after="120"/>
+        <w:ind w:left="85"/>
         <w:jc w:val="left"/>
         <w:rPr>
           <w:rFonts w:ascii="Arial" w:hAnsi="Arial" w:cs="Arial"/>
-          <w:color w:themeColor="text1" w:val="000000"/>
+          <w:color w:val="000000" w:themeColor="text1"/>
           <w:sz w:val="24"/>
           <w:szCs w:val="24"/>
           <w:lang w:val="pt-BR"/>
@@ -522,8 +702,8 @@
       </w:pPr>
       <w:r>
         <w:rPr>
-          <w:rFonts w:cs="Arial" w:ascii="Arial" w:hAnsi="Arial"/>
-          <w:color w:themeColor="text1" w:val="000000"/>
+          <w:rFonts w:ascii="Arial" w:hAnsi="Arial" w:cs="Arial"/>
+          <w:color w:val="000000" w:themeColor="text1"/>
           <w:sz w:val="24"/>
           <w:szCs w:val="24"/>
           <w:lang w:val="pt-BR"/>
@@ -533,20 +713,23 @@
     </w:p>
     <w:p>
       <w:pPr>
+        <w:rPr>
+          <w:lang w:val="pt-BR"/>
+        </w:rPr>
         <w:sectPr>
           <w:type w:val="continuous"/>
           <w:pgSz w:w="11906" w:h="16838"/>
-          <w:pgMar w:left="1134" w:right="1134" w:gutter="0" w:header="0" w:top="709" w:footer="0" w:bottom="1134"/>
-          <w:formProt w:val="false"/>
-          <w:textDirection w:val="lrTb"/>
-          <w:docGrid w:type="default" w:linePitch="360" w:charSpace="16384"/>
+          <w:pgMar w:top="709" w:right="1134" w:bottom="1134" w:left="1134" w:header="0" w:footer="0" w:gutter="0"/>
+          <w:cols w:space="720"/>
+          <w:formProt w:val="0"/>
+          <w:docGrid w:linePitch="360" w:charSpace="16384"/>
         </w:sectPr>
       </w:pPr>
     </w:p>
     <w:p>
       <w:pPr>
         <w:pStyle w:val="TAMainText"/>
-        <w:ind w:hanging="0" w:left="86" w:right="130"/>
+        <w:ind w:left="86" w:right="130" w:firstLine="0"/>
         <w:rPr>
           <w:rFonts w:ascii="Arial" w:hAnsi="Arial" w:cs="Arial"/>
           <w:lang w:val="pt-BR"/>
@@ -554,7 +737,7 @@
       </w:pPr>
       <w:r>
         <w:rPr>
-          <w:rFonts w:cs="Arial" w:ascii="Arial" w:hAnsi="Arial"/>
+          <w:rFonts w:ascii="Arial" w:hAnsi="Arial" w:cs="Arial"/>
           <w:sz w:val="22"/>
           <w:szCs w:val="22"/>
           <w:lang w:val="pt-BR"/>
@@ -563,16 +746,16 @@
       </w:r>
       <w:r>
         <w:rPr>
-          <w:rFonts w:eastAsia="Arial" w:cs="Arial" w:ascii="Arial" w:hAnsi="Arial"/>
-          <w:sz w:val="22"/>
-          <w:szCs w:val="22"/>
-          <w:lang w:val="pt-BR"/>
-        </w:rPr>
-        <w:t xml:space="preserve"> </w:t>
-      </w:r>
-      <w:r>
-        <w:rPr>
-          <w:rFonts w:cs="Arial" w:ascii="Arial" w:hAnsi="Arial"/>
+          <w:rFonts w:ascii="Arial" w:eastAsia="Arial" w:hAnsi="Arial" w:cs="Arial"/>
+          <w:sz w:val="22"/>
+          <w:szCs w:val="22"/>
+          <w:lang w:val="pt-BR"/>
+        </w:rPr>
+        <w:t xml:space="preserve"> </w:t>
+      </w:r>
+      <w:r>
+        <w:rPr>
+          <w:rFonts w:ascii="Arial" w:hAnsi="Arial" w:cs="Arial"/>
           <w:sz w:val="22"/>
           <w:szCs w:val="22"/>
           <w:lang w:val="pt-BR"/>
@@ -581,16 +764,16 @@
       </w:r>
       <w:r>
         <w:rPr>
-          <w:rFonts w:eastAsia="Arial" w:cs="Arial" w:ascii="Arial" w:hAnsi="Arial"/>
-          <w:sz w:val="22"/>
-          <w:szCs w:val="22"/>
-          <w:lang w:val="pt-BR"/>
-        </w:rPr>
-        <w:t xml:space="preserve"> </w:t>
-      </w:r>
-      <w:r>
-        <w:rPr>
-          <w:rFonts w:cs="Arial" w:ascii="Arial" w:hAnsi="Arial"/>
+          <w:rFonts w:ascii="Arial" w:eastAsia="Arial" w:hAnsi="Arial" w:cs="Arial"/>
+          <w:sz w:val="22"/>
+          <w:szCs w:val="22"/>
+          <w:lang w:val="pt-BR"/>
+        </w:rPr>
+        <w:t xml:space="preserve"> </w:t>
+      </w:r>
+      <w:r>
+        <w:rPr>
+          <w:rFonts w:ascii="Arial" w:hAnsi="Arial" w:cs="Arial"/>
           <w:sz w:val="22"/>
           <w:szCs w:val="22"/>
           <w:lang w:val="pt-BR"/>
@@ -599,16 +782,16 @@
       </w:r>
       <w:r>
         <w:rPr>
-          <w:rFonts w:eastAsia="Arial" w:cs="Arial" w:ascii="Arial" w:hAnsi="Arial"/>
-          <w:sz w:val="22"/>
-          <w:szCs w:val="22"/>
-          <w:lang w:val="pt-BR"/>
-        </w:rPr>
-        <w:t xml:space="preserve"> </w:t>
-      </w:r>
-      <w:r>
-        <w:rPr>
-          <w:rFonts w:cs="Arial" w:ascii="Arial" w:hAnsi="Arial"/>
+          <w:rFonts w:ascii="Arial" w:eastAsia="Arial" w:hAnsi="Arial" w:cs="Arial"/>
+          <w:sz w:val="22"/>
+          <w:szCs w:val="22"/>
+          <w:lang w:val="pt-BR"/>
+        </w:rPr>
+        <w:t xml:space="preserve"> </w:t>
+      </w:r>
+      <w:r>
+        <w:rPr>
+          <w:rFonts w:ascii="Arial" w:hAnsi="Arial" w:cs="Arial"/>
           <w:sz w:val="22"/>
           <w:szCs w:val="22"/>
           <w:lang w:val="pt-BR"/>
@@ -617,16 +800,16 @@
       </w:r>
       <w:r>
         <w:rPr>
-          <w:rFonts w:eastAsia="Arial" w:cs="Arial" w:ascii="Arial" w:hAnsi="Arial"/>
-          <w:sz w:val="22"/>
-          <w:szCs w:val="22"/>
-          <w:lang w:val="pt-BR"/>
-        </w:rPr>
-        <w:t xml:space="preserve"> </w:t>
-      </w:r>
-      <w:r>
-        <w:rPr>
-          <w:rFonts w:cs="Arial" w:ascii="Arial" w:hAnsi="Arial"/>
+          <w:rFonts w:ascii="Arial" w:eastAsia="Arial" w:hAnsi="Arial" w:cs="Arial"/>
+          <w:sz w:val="22"/>
+          <w:szCs w:val="22"/>
+          <w:lang w:val="pt-BR"/>
+        </w:rPr>
+        <w:t xml:space="preserve"> </w:t>
+      </w:r>
+      <w:r>
+        <w:rPr>
+          <w:rFonts w:ascii="Arial" w:hAnsi="Arial" w:cs="Arial"/>
           <w:sz w:val="22"/>
           <w:szCs w:val="22"/>
           <w:lang w:val="pt-BR"/>
@@ -635,16 +818,16 @@
       </w:r>
       <w:r>
         <w:rPr>
-          <w:rFonts w:eastAsia="Arial" w:cs="Arial" w:ascii="Arial" w:hAnsi="Arial"/>
-          <w:sz w:val="22"/>
-          <w:szCs w:val="22"/>
-          <w:lang w:val="pt-BR"/>
-        </w:rPr>
-        <w:t xml:space="preserve"> </w:t>
-      </w:r>
-      <w:r>
-        <w:rPr>
-          <w:rFonts w:cs="Arial" w:ascii="Arial" w:hAnsi="Arial"/>
+          <w:rFonts w:ascii="Arial" w:eastAsia="Arial" w:hAnsi="Arial" w:cs="Arial"/>
+          <w:sz w:val="22"/>
+          <w:szCs w:val="22"/>
+          <w:lang w:val="pt-BR"/>
+        </w:rPr>
+        <w:t xml:space="preserve"> </w:t>
+      </w:r>
+      <w:r>
+        <w:rPr>
+          <w:rFonts w:ascii="Arial" w:hAnsi="Arial" w:cs="Arial"/>
           <w:sz w:val="22"/>
           <w:szCs w:val="22"/>
           <w:lang w:val="pt-BR"/>
@@ -653,16 +836,16 @@
       </w:r>
       <w:r>
         <w:rPr>
-          <w:rFonts w:eastAsia="Arial" w:cs="Arial" w:ascii="Arial" w:hAnsi="Arial"/>
-          <w:sz w:val="22"/>
-          <w:szCs w:val="22"/>
-          <w:lang w:val="pt-BR"/>
-        </w:rPr>
-        <w:t xml:space="preserve"> </w:t>
-      </w:r>
-      <w:r>
-        <w:rPr>
-          <w:rFonts w:cs="Arial" w:ascii="Arial" w:hAnsi="Arial"/>
+          <w:rFonts w:ascii="Arial" w:eastAsia="Arial" w:hAnsi="Arial" w:cs="Arial"/>
+          <w:sz w:val="22"/>
+          <w:szCs w:val="22"/>
+          <w:lang w:val="pt-BR"/>
+        </w:rPr>
+        <w:t xml:space="preserve"> </w:t>
+      </w:r>
+      <w:r>
+        <w:rPr>
+          <w:rFonts w:ascii="Arial" w:hAnsi="Arial" w:cs="Arial"/>
           <w:sz w:val="22"/>
           <w:szCs w:val="22"/>
           <w:lang w:val="pt-BR"/>
@@ -671,16 +854,16 @@
       </w:r>
       <w:r>
         <w:rPr>
-          <w:rFonts w:eastAsia="Arial" w:cs="Arial" w:ascii="Arial" w:hAnsi="Arial"/>
-          <w:sz w:val="22"/>
-          <w:szCs w:val="22"/>
-          <w:lang w:val="pt-BR"/>
-        </w:rPr>
-        <w:t xml:space="preserve"> </w:t>
-      </w:r>
-      <w:r>
-        <w:rPr>
-          <w:rFonts w:cs="Arial" w:ascii="Arial" w:hAnsi="Arial"/>
+          <w:rFonts w:ascii="Arial" w:eastAsia="Arial" w:hAnsi="Arial" w:cs="Arial"/>
+          <w:sz w:val="22"/>
+          <w:szCs w:val="22"/>
+          <w:lang w:val="pt-BR"/>
+        </w:rPr>
+        <w:t xml:space="preserve"> </w:t>
+      </w:r>
+      <w:r>
+        <w:rPr>
+          <w:rFonts w:ascii="Arial" w:hAnsi="Arial" w:cs="Arial"/>
           <w:sz w:val="22"/>
           <w:szCs w:val="22"/>
           <w:lang w:val="pt-BR"/>
@@ -689,16 +872,16 @@
       </w:r>
       <w:r>
         <w:rPr>
-          <w:rFonts w:eastAsia="Arial" w:cs="Arial" w:ascii="Arial" w:hAnsi="Arial"/>
-          <w:sz w:val="22"/>
-          <w:szCs w:val="22"/>
-          <w:lang w:val="pt-BR"/>
-        </w:rPr>
-        <w:t xml:space="preserve"> </w:t>
-      </w:r>
-      <w:r>
-        <w:rPr>
-          <w:rFonts w:cs="Arial" w:ascii="Arial" w:hAnsi="Arial"/>
+          <w:rFonts w:ascii="Arial" w:eastAsia="Arial" w:hAnsi="Arial" w:cs="Arial"/>
+          <w:sz w:val="22"/>
+          <w:szCs w:val="22"/>
+          <w:lang w:val="pt-BR"/>
+        </w:rPr>
+        <w:t xml:space="preserve"> </w:t>
+      </w:r>
+      <w:r>
+        <w:rPr>
+          <w:rFonts w:ascii="Arial" w:hAnsi="Arial" w:cs="Arial"/>
           <w:sz w:val="22"/>
           <w:szCs w:val="22"/>
           <w:lang w:val="pt-BR"/>
@@ -707,16 +890,16 @@
       </w:r>
       <w:r>
         <w:rPr>
-          <w:rFonts w:eastAsia="Arial" w:cs="Arial" w:ascii="Arial" w:hAnsi="Arial"/>
-          <w:sz w:val="22"/>
-          <w:szCs w:val="22"/>
-          <w:lang w:val="pt-BR"/>
-        </w:rPr>
-        <w:t xml:space="preserve"> </w:t>
-      </w:r>
-      <w:r>
-        <w:rPr>
-          <w:rFonts w:cs="Arial" w:ascii="Arial" w:hAnsi="Arial"/>
+          <w:rFonts w:ascii="Arial" w:eastAsia="Arial" w:hAnsi="Arial" w:cs="Arial"/>
+          <w:sz w:val="22"/>
+          <w:szCs w:val="22"/>
+          <w:lang w:val="pt-BR"/>
+        </w:rPr>
+        <w:t xml:space="preserve"> </w:t>
+      </w:r>
+      <w:r>
+        <w:rPr>
+          <w:rFonts w:ascii="Arial" w:hAnsi="Arial" w:cs="Arial"/>
           <w:sz w:val="22"/>
           <w:szCs w:val="22"/>
           <w:lang w:val="pt-BR"/>
@@ -725,7 +908,7 @@
       </w:r>
       <w:r>
         <w:rPr>
-          <w:rFonts w:eastAsia="Arial" w:cs="Arial" w:ascii="Arial" w:hAnsi="Arial"/>
+          <w:rFonts w:ascii="Arial" w:eastAsia="Arial" w:hAnsi="Arial" w:cs="Arial"/>
           <w:sz w:val="22"/>
           <w:szCs w:val="22"/>
           <w:lang w:val="pt-BR"/>
@@ -734,7 +917,7 @@
       </w:r>
       <w:r>
         <w:rPr>
-          <w:rFonts w:cs="Arial" w:ascii="Arial" w:hAnsi="Arial"/>
+          <w:rFonts w:ascii="Arial" w:hAnsi="Arial" w:cs="Arial"/>
           <w:sz w:val="22"/>
           <w:szCs w:val="22"/>
           <w:lang w:val="pt-BR"/>
@@ -743,16 +926,16 @@
       </w:r>
       <w:r>
         <w:rPr>
-          <w:rFonts w:eastAsia="Arial" w:cs="Arial" w:ascii="Arial" w:hAnsi="Arial"/>
-          <w:sz w:val="22"/>
-          <w:szCs w:val="22"/>
-          <w:lang w:val="pt-BR"/>
-        </w:rPr>
-        <w:t xml:space="preserve"> </w:t>
-      </w:r>
-      <w:r>
-        <w:rPr>
-          <w:rFonts w:cs="Arial" w:ascii="Arial" w:hAnsi="Arial"/>
+          <w:rFonts w:ascii="Arial" w:eastAsia="Arial" w:hAnsi="Arial" w:cs="Arial"/>
+          <w:sz w:val="22"/>
+          <w:szCs w:val="22"/>
+          <w:lang w:val="pt-BR"/>
+        </w:rPr>
+        <w:t xml:space="preserve"> </w:t>
+      </w:r>
+      <w:r>
+        <w:rPr>
+          <w:rFonts w:ascii="Arial" w:hAnsi="Arial" w:cs="Arial"/>
           <w:sz w:val="22"/>
           <w:szCs w:val="22"/>
           <w:lang w:val="pt-BR"/>
@@ -761,16 +944,16 @@
       </w:r>
       <w:r>
         <w:rPr>
-          <w:rFonts w:eastAsia="Arial" w:cs="Arial" w:ascii="Arial" w:hAnsi="Arial"/>
-          <w:sz w:val="22"/>
-          <w:szCs w:val="22"/>
-          <w:lang w:val="pt-BR"/>
-        </w:rPr>
-        <w:t xml:space="preserve"> </w:t>
-      </w:r>
-      <w:r>
-        <w:rPr>
-          <w:rFonts w:cs="Arial" w:ascii="Arial" w:hAnsi="Arial"/>
+          <w:rFonts w:ascii="Arial" w:eastAsia="Arial" w:hAnsi="Arial" w:cs="Arial"/>
+          <w:sz w:val="22"/>
+          <w:szCs w:val="22"/>
+          <w:lang w:val="pt-BR"/>
+        </w:rPr>
+        <w:t xml:space="preserve"> </w:t>
+      </w:r>
+      <w:r>
+        <w:rPr>
+          <w:rFonts w:ascii="Arial" w:hAnsi="Arial" w:cs="Arial"/>
           <w:sz w:val="22"/>
           <w:szCs w:val="22"/>
           <w:lang w:val="pt-BR"/>
@@ -779,16 +962,16 @@
       </w:r>
       <w:r>
         <w:rPr>
-          <w:rFonts w:eastAsia="Arial" w:cs="Arial" w:ascii="Arial" w:hAnsi="Arial"/>
-          <w:sz w:val="22"/>
-          <w:szCs w:val="22"/>
-          <w:lang w:val="pt-BR"/>
-        </w:rPr>
-        <w:t xml:space="preserve"> </w:t>
-      </w:r>
-      <w:r>
-        <w:rPr>
-          <w:rFonts w:cs="Arial" w:ascii="Arial" w:hAnsi="Arial"/>
+          <w:rFonts w:ascii="Arial" w:eastAsia="Arial" w:hAnsi="Arial" w:cs="Arial"/>
+          <w:sz w:val="22"/>
+          <w:szCs w:val="22"/>
+          <w:lang w:val="pt-BR"/>
+        </w:rPr>
+        <w:t xml:space="preserve"> </w:t>
+      </w:r>
+      <w:r>
+        <w:rPr>
+          <w:rFonts w:ascii="Arial" w:hAnsi="Arial" w:cs="Arial"/>
           <w:sz w:val="22"/>
           <w:szCs w:val="22"/>
           <w:lang w:val="pt-BR"/>
@@ -797,16 +980,16 @@
       </w:r>
       <w:r>
         <w:rPr>
-          <w:rFonts w:eastAsia="Arial" w:cs="Arial" w:ascii="Arial" w:hAnsi="Arial"/>
-          <w:sz w:val="22"/>
-          <w:szCs w:val="22"/>
-          <w:lang w:val="pt-BR"/>
-        </w:rPr>
-        <w:t xml:space="preserve"> </w:t>
-      </w:r>
-      <w:r>
-        <w:rPr>
-          <w:rFonts w:cs="Arial" w:ascii="Arial" w:hAnsi="Arial"/>
+          <w:rFonts w:ascii="Arial" w:eastAsia="Arial" w:hAnsi="Arial" w:cs="Arial"/>
+          <w:sz w:val="22"/>
+          <w:szCs w:val="22"/>
+          <w:lang w:val="pt-BR"/>
+        </w:rPr>
+        <w:t xml:space="preserve"> </w:t>
+      </w:r>
+      <w:r>
+        <w:rPr>
+          <w:rFonts w:ascii="Arial" w:hAnsi="Arial" w:cs="Arial"/>
           <w:sz w:val="22"/>
           <w:szCs w:val="22"/>
           <w:lang w:val="pt-BR"/>
@@ -815,16 +998,16 @@
       </w:r>
       <w:r>
         <w:rPr>
-          <w:rFonts w:eastAsia="Arial" w:cs="Arial" w:ascii="Arial" w:hAnsi="Arial"/>
-          <w:sz w:val="22"/>
-          <w:szCs w:val="22"/>
-          <w:lang w:val="pt-BR"/>
-        </w:rPr>
-        <w:t xml:space="preserve"> </w:t>
-      </w:r>
-      <w:r>
-        <w:rPr>
-          <w:rFonts w:cs="Arial" w:ascii="Arial" w:hAnsi="Arial"/>
+          <w:rFonts w:ascii="Arial" w:eastAsia="Arial" w:hAnsi="Arial" w:cs="Arial"/>
+          <w:sz w:val="22"/>
+          <w:szCs w:val="22"/>
+          <w:lang w:val="pt-BR"/>
+        </w:rPr>
+        <w:t xml:space="preserve"> </w:t>
+      </w:r>
+      <w:r>
+        <w:rPr>
+          <w:rFonts w:ascii="Arial" w:hAnsi="Arial" w:cs="Arial"/>
           <w:sz w:val="22"/>
           <w:szCs w:val="22"/>
           <w:lang w:val="pt-BR"/>
@@ -833,21 +1016,29 @@
       </w:r>
       <w:r>
         <w:rPr>
-          <w:rFonts w:eastAsia="Arial" w:cs="Arial" w:ascii="Arial" w:hAnsi="Arial"/>
-          <w:sz w:val="22"/>
-          <w:szCs w:val="22"/>
-          <w:lang w:val="pt-BR"/>
-        </w:rPr>
-        <w:t xml:space="preserve"> </w:t>
-      </w:r>
-      <w:r>
-        <w:rPr>
-          <w:rFonts w:cs="Arial" w:ascii="Arial" w:hAnsi="Arial"/>
+          <w:rFonts w:ascii="Arial" w:eastAsia="Arial" w:hAnsi="Arial" w:cs="Arial"/>
+          <w:sz w:val="22"/>
+          <w:szCs w:val="22"/>
+          <w:lang w:val="pt-BR"/>
+        </w:rPr>
+        <w:t xml:space="preserve"> </w:t>
+      </w:r>
+      <w:r>
+        <w:rPr>
+          <w:rFonts w:ascii="Arial" w:hAnsi="Arial" w:cs="Arial"/>
           <w:sz w:val="22"/>
           <w:szCs w:val="22"/>
           <w:lang w:val="pt-BR"/>
         </w:rPr>
         <w:t>laterais.</w:t>
+      </w:r>
+      <w:r>
+        <w:rPr>
+          <w:rFonts w:ascii="Arial" w:hAnsi="Arial" w:cs="Arial"/>
+          <w:sz w:val="22"/>
+          <w:szCs w:val="22"/>
+          <w:lang w:val="pt-BR"/>
+        </w:rPr>
         <w:tab/>
       </w:r>
     </w:p>
@@ -860,13 +1051,13 @@
           <w:bottom w:val="single" w:sz="4" w:space="0" w:color="000000"/>
           <w:right w:val="single" w:sz="4" w:space="4" w:color="000000"/>
         </w:pBdr>
-        <w:shd w:val="clear" w:color="auto" w:fill="D9D9D9" w:themeFill="background1" w:themeFillShade="d9"/>
-        <w:spacing w:before="200" w:after="120"/>
-        <w:ind w:left="85" w:right="130"/>
+        <w:shd w:val="clear" w:color="auto" w:fill="D9D9D9" w:themeFill="background1" w:themeFillShade="D9"/>
+        <w:spacing w:after="120"/>
+        <w:ind w:left="85"/>
         <w:jc w:val="left"/>
         <w:rPr>
           <w:rFonts w:ascii="Arial" w:hAnsi="Arial" w:cs="Arial"/>
-          <w:color w:themeColor="text1" w:val="000000"/>
+          <w:color w:val="000000" w:themeColor="text1"/>
           <w:sz w:val="24"/>
           <w:szCs w:val="24"/>
           <w:lang w:val="pt-BR"/>
@@ -874,8 +1065,8 @@
       </w:pPr>
       <w:r>
         <w:rPr>
-          <w:rFonts w:cs="Arial" w:ascii="Arial" w:hAnsi="Arial"/>
-          <w:color w:themeColor="text1" w:val="000000"/>
+          <w:rFonts w:ascii="Arial" w:hAnsi="Arial" w:cs="Arial"/>
+          <w:color w:val="000000" w:themeColor="text1"/>
           <w:sz w:val="24"/>
           <w:szCs w:val="24"/>
           <w:lang w:val="pt-BR"/>
@@ -885,20 +1076,23 @@
     </w:p>
     <w:p>
       <w:pPr>
+        <w:rPr>
+          <w:lang w:val="pt-BR"/>
+        </w:rPr>
         <w:sectPr>
           <w:type w:val="continuous"/>
           <w:pgSz w:w="11906" w:h="16838"/>
-          <w:pgMar w:left="1134" w:right="1134" w:gutter="0" w:header="0" w:top="709" w:footer="0" w:bottom="1134"/>
-          <w:formProt w:val="false"/>
-          <w:textDirection w:val="lrTb"/>
-          <w:docGrid w:type="default" w:linePitch="360" w:charSpace="16384"/>
+          <w:pgMar w:top="709" w:right="1134" w:bottom="1134" w:left="1134" w:header="0" w:footer="0" w:gutter="0"/>
+          <w:cols w:space="720"/>
+          <w:formProt w:val="0"/>
+          <w:docGrid w:linePitch="360" w:charSpace="16384"/>
         </w:sectPr>
       </w:pPr>
     </w:p>
     <w:p>
       <w:pPr>
         <w:pStyle w:val="TAMainText"/>
-        <w:ind w:hanging="0" w:left="86" w:right="130"/>
+        <w:ind w:left="86" w:right="130" w:firstLine="0"/>
         <w:rPr>
           <w:rFonts w:ascii="Arial" w:hAnsi="Arial" w:cs="Arial"/>
           <w:lang w:val="pt-BR"/>
@@ -906,7 +1100,7 @@
       </w:pPr>
       <w:r>
         <w:rPr>
-          <w:rFonts w:cs="Arial" w:ascii="Arial" w:hAnsi="Arial"/>
+          <w:rFonts w:ascii="Arial" w:hAnsi="Arial" w:cs="Arial"/>
           <w:sz w:val="22"/>
           <w:szCs w:val="22"/>
           <w:lang w:val="pt-BR"/>
@@ -915,16 +1109,16 @@
       </w:r>
       <w:r>
         <w:rPr>
-          <w:rFonts w:eastAsia="Arial" w:cs="Arial" w:ascii="Arial" w:hAnsi="Arial"/>
-          <w:sz w:val="22"/>
-          <w:szCs w:val="22"/>
-          <w:lang w:val="pt-BR"/>
-        </w:rPr>
-        <w:t xml:space="preserve"> </w:t>
-      </w:r>
-      <w:r>
-        <w:rPr>
-          <w:rFonts w:cs="Arial" w:ascii="Arial" w:hAnsi="Arial"/>
+          <w:rFonts w:ascii="Arial" w:eastAsia="Arial" w:hAnsi="Arial" w:cs="Arial"/>
+          <w:sz w:val="22"/>
+          <w:szCs w:val="22"/>
+          <w:lang w:val="pt-BR"/>
+        </w:rPr>
+        <w:t xml:space="preserve"> </w:t>
+      </w:r>
+      <w:r>
+        <w:rPr>
+          <w:rFonts w:ascii="Arial" w:hAnsi="Arial" w:cs="Arial"/>
           <w:sz w:val="22"/>
           <w:szCs w:val="22"/>
           <w:lang w:val="pt-BR"/>
@@ -933,16 +1127,16 @@
       </w:r>
       <w:r>
         <w:rPr>
-          <w:rFonts w:eastAsia="Arial" w:cs="Arial" w:ascii="Arial" w:hAnsi="Arial"/>
-          <w:sz w:val="22"/>
-          <w:szCs w:val="22"/>
-          <w:lang w:val="pt-BR"/>
-        </w:rPr>
-        <w:t xml:space="preserve"> </w:t>
-      </w:r>
-      <w:r>
-        <w:rPr>
-          <w:rFonts w:cs="Arial" w:ascii="Arial" w:hAnsi="Arial"/>
+          <w:rFonts w:ascii="Arial" w:eastAsia="Arial" w:hAnsi="Arial" w:cs="Arial"/>
+          <w:sz w:val="22"/>
+          <w:szCs w:val="22"/>
+          <w:lang w:val="pt-BR"/>
+        </w:rPr>
+        <w:t xml:space="preserve"> </w:t>
+      </w:r>
+      <w:r>
+        <w:rPr>
+          <w:rFonts w:ascii="Arial" w:hAnsi="Arial" w:cs="Arial"/>
           <w:sz w:val="22"/>
           <w:szCs w:val="22"/>
           <w:lang w:val="pt-BR"/>
@@ -951,16 +1145,16 @@
       </w:r>
       <w:r>
         <w:rPr>
-          <w:rFonts w:eastAsia="Arial" w:cs="Arial" w:ascii="Arial" w:hAnsi="Arial"/>
-          <w:sz w:val="22"/>
-          <w:szCs w:val="22"/>
-          <w:lang w:val="pt-BR"/>
-        </w:rPr>
-        <w:t xml:space="preserve"> </w:t>
-      </w:r>
-      <w:r>
-        <w:rPr>
-          <w:rFonts w:cs="Arial" w:ascii="Arial" w:hAnsi="Arial"/>
+          <w:rFonts w:ascii="Arial" w:eastAsia="Arial" w:hAnsi="Arial" w:cs="Arial"/>
+          <w:sz w:val="22"/>
+          <w:szCs w:val="22"/>
+          <w:lang w:val="pt-BR"/>
+        </w:rPr>
+        <w:t xml:space="preserve"> </w:t>
+      </w:r>
+      <w:r>
+        <w:rPr>
+          <w:rFonts w:ascii="Arial" w:hAnsi="Arial" w:cs="Arial"/>
           <w:sz w:val="22"/>
           <w:szCs w:val="22"/>
           <w:lang w:val="pt-BR"/>
@@ -969,16 +1163,16 @@
       </w:r>
       <w:r>
         <w:rPr>
-          <w:rFonts w:eastAsia="Arial" w:cs="Arial" w:ascii="Arial" w:hAnsi="Arial"/>
-          <w:sz w:val="22"/>
-          <w:szCs w:val="22"/>
-          <w:lang w:val="pt-BR"/>
-        </w:rPr>
-        <w:t xml:space="preserve"> </w:t>
-      </w:r>
-      <w:r>
-        <w:rPr>
-          <w:rFonts w:cs="Arial" w:ascii="Arial" w:hAnsi="Arial"/>
+          <w:rFonts w:ascii="Arial" w:eastAsia="Arial" w:hAnsi="Arial" w:cs="Arial"/>
+          <w:sz w:val="22"/>
+          <w:szCs w:val="22"/>
+          <w:lang w:val="pt-BR"/>
+        </w:rPr>
+        <w:t xml:space="preserve"> </w:t>
+      </w:r>
+      <w:r>
+        <w:rPr>
+          <w:rFonts w:ascii="Arial" w:hAnsi="Arial" w:cs="Arial"/>
           <w:sz w:val="22"/>
           <w:szCs w:val="22"/>
           <w:lang w:val="pt-BR"/>
@@ -987,16 +1181,16 @@
       </w:r>
       <w:r>
         <w:rPr>
-          <w:rFonts w:eastAsia="Arial" w:cs="Arial" w:ascii="Arial" w:hAnsi="Arial"/>
-          <w:sz w:val="22"/>
-          <w:szCs w:val="22"/>
-          <w:lang w:val="pt-BR"/>
-        </w:rPr>
-        <w:t xml:space="preserve"> </w:t>
-      </w:r>
-      <w:r>
-        <w:rPr>
-          <w:rFonts w:cs="Arial" w:ascii="Arial" w:hAnsi="Arial"/>
+          <w:rFonts w:ascii="Arial" w:eastAsia="Arial" w:hAnsi="Arial" w:cs="Arial"/>
+          <w:sz w:val="22"/>
+          <w:szCs w:val="22"/>
+          <w:lang w:val="pt-BR"/>
+        </w:rPr>
+        <w:t xml:space="preserve"> </w:t>
+      </w:r>
+      <w:r>
+        <w:rPr>
+          <w:rFonts w:ascii="Arial" w:hAnsi="Arial" w:cs="Arial"/>
           <w:sz w:val="22"/>
           <w:szCs w:val="22"/>
           <w:lang w:val="pt-BR"/>
@@ -1005,16 +1199,16 @@
       </w:r>
       <w:r>
         <w:rPr>
-          <w:rFonts w:eastAsia="Arial" w:cs="Arial" w:ascii="Arial" w:hAnsi="Arial"/>
-          <w:sz w:val="22"/>
-          <w:szCs w:val="22"/>
-          <w:lang w:val="pt-BR"/>
-        </w:rPr>
-        <w:t xml:space="preserve"> </w:t>
-      </w:r>
-      <w:r>
-        <w:rPr>
-          <w:rFonts w:cs="Arial" w:ascii="Arial" w:hAnsi="Arial"/>
+          <w:rFonts w:ascii="Arial" w:eastAsia="Arial" w:hAnsi="Arial" w:cs="Arial"/>
+          <w:sz w:val="22"/>
+          <w:szCs w:val="22"/>
+          <w:lang w:val="pt-BR"/>
+        </w:rPr>
+        <w:t xml:space="preserve"> </w:t>
+      </w:r>
+      <w:r>
+        <w:rPr>
+          <w:rFonts w:ascii="Arial" w:hAnsi="Arial" w:cs="Arial"/>
           <w:sz w:val="22"/>
           <w:szCs w:val="22"/>
           <w:lang w:val="pt-BR"/>
@@ -1023,7 +1217,7 @@
       </w:r>
       <w:r>
         <w:rPr>
-          <w:rFonts w:eastAsia="Arial" w:cs="Arial" w:ascii="Arial" w:hAnsi="Arial"/>
+          <w:rFonts w:ascii="Arial" w:eastAsia="Arial" w:hAnsi="Arial" w:cs="Arial"/>
           <w:sz w:val="22"/>
           <w:szCs w:val="22"/>
           <w:lang w:val="pt-BR"/>
@@ -1032,7 +1226,7 @@
       </w:r>
       <w:r>
         <w:rPr>
-          <w:rFonts w:cs="Arial" w:ascii="Arial" w:hAnsi="Arial"/>
+          <w:rFonts w:ascii="Arial" w:hAnsi="Arial" w:cs="Arial"/>
           <w:sz w:val="22"/>
           <w:szCs w:val="22"/>
           <w:lang w:val="pt-BR"/>
@@ -1041,16 +1235,16 @@
       </w:r>
       <w:r>
         <w:rPr>
-          <w:rFonts w:eastAsia="Arial" w:cs="Arial" w:ascii="Arial" w:hAnsi="Arial"/>
-          <w:sz w:val="22"/>
-          <w:szCs w:val="22"/>
-          <w:lang w:val="pt-BR"/>
-        </w:rPr>
-        <w:t xml:space="preserve"> </w:t>
-      </w:r>
-      <w:r>
-        <w:rPr>
-          <w:rFonts w:cs="Arial" w:ascii="Arial" w:hAnsi="Arial"/>
+          <w:rFonts w:ascii="Arial" w:eastAsia="Arial" w:hAnsi="Arial" w:cs="Arial"/>
+          <w:sz w:val="22"/>
+          <w:szCs w:val="22"/>
+          <w:lang w:val="pt-BR"/>
+        </w:rPr>
+        <w:t xml:space="preserve"> </w:t>
+      </w:r>
+      <w:r>
+        <w:rPr>
+          <w:rFonts w:ascii="Arial" w:hAnsi="Arial" w:cs="Arial"/>
           <w:sz w:val="22"/>
           <w:szCs w:val="22"/>
           <w:lang w:val="pt-BR"/>
@@ -1059,16 +1253,16 @@
       </w:r>
       <w:r>
         <w:rPr>
-          <w:rFonts w:eastAsia="Arial" w:cs="Arial" w:ascii="Arial" w:hAnsi="Arial"/>
-          <w:sz w:val="22"/>
-          <w:szCs w:val="22"/>
-          <w:lang w:val="pt-BR"/>
-        </w:rPr>
-        <w:t xml:space="preserve"> </w:t>
-      </w:r>
-      <w:r>
-        <w:rPr>
-          <w:rFonts w:cs="Arial" w:ascii="Arial" w:hAnsi="Arial"/>
+          <w:rFonts w:ascii="Arial" w:eastAsia="Arial" w:hAnsi="Arial" w:cs="Arial"/>
+          <w:sz w:val="22"/>
+          <w:szCs w:val="22"/>
+          <w:lang w:val="pt-BR"/>
+        </w:rPr>
+        <w:t xml:space="preserve"> </w:t>
+      </w:r>
+      <w:r>
+        <w:rPr>
+          <w:rFonts w:ascii="Arial" w:hAnsi="Arial" w:cs="Arial"/>
           <w:sz w:val="22"/>
           <w:szCs w:val="22"/>
           <w:lang w:val="pt-BR"/>
@@ -1077,16 +1271,16 @@
       </w:r>
       <w:r>
         <w:rPr>
-          <w:rFonts w:eastAsia="Arial" w:cs="Arial" w:ascii="Arial" w:hAnsi="Arial"/>
-          <w:sz w:val="22"/>
-          <w:szCs w:val="22"/>
-          <w:lang w:val="pt-BR"/>
-        </w:rPr>
-        <w:t xml:space="preserve"> </w:t>
-      </w:r>
-      <w:r>
-        <w:rPr>
-          <w:rFonts w:cs="Arial" w:ascii="Arial" w:hAnsi="Arial"/>
+          <w:rFonts w:ascii="Arial" w:eastAsia="Arial" w:hAnsi="Arial" w:cs="Arial"/>
+          <w:sz w:val="22"/>
+          <w:szCs w:val="22"/>
+          <w:lang w:val="pt-BR"/>
+        </w:rPr>
+        <w:t xml:space="preserve"> </w:t>
+      </w:r>
+      <w:r>
+        <w:rPr>
+          <w:rFonts w:ascii="Arial" w:hAnsi="Arial" w:cs="Arial"/>
           <w:sz w:val="22"/>
           <w:szCs w:val="22"/>
           <w:lang w:val="pt-BR"/>
@@ -1095,16 +1289,16 @@
       </w:r>
       <w:r>
         <w:rPr>
-          <w:rFonts w:eastAsia="Arial" w:cs="Arial" w:ascii="Arial" w:hAnsi="Arial"/>
-          <w:sz w:val="22"/>
-          <w:szCs w:val="22"/>
-          <w:lang w:val="pt-BR"/>
-        </w:rPr>
-        <w:t xml:space="preserve"> </w:t>
-      </w:r>
-      <w:r>
-        <w:rPr>
-          <w:rFonts w:cs="Arial" w:ascii="Arial" w:hAnsi="Arial"/>
+          <w:rFonts w:ascii="Arial" w:eastAsia="Arial" w:hAnsi="Arial" w:cs="Arial"/>
+          <w:sz w:val="22"/>
+          <w:szCs w:val="22"/>
+          <w:lang w:val="pt-BR"/>
+        </w:rPr>
+        <w:t xml:space="preserve"> </w:t>
+      </w:r>
+      <w:r>
+        <w:rPr>
+          <w:rFonts w:ascii="Arial" w:hAnsi="Arial" w:cs="Arial"/>
           <w:sz w:val="22"/>
           <w:szCs w:val="22"/>
           <w:lang w:val="pt-BR"/>
@@ -1113,16 +1307,16 @@
       </w:r>
       <w:r>
         <w:rPr>
-          <w:rFonts w:eastAsia="Arial" w:cs="Arial" w:ascii="Arial" w:hAnsi="Arial"/>
-          <w:sz w:val="22"/>
-          <w:szCs w:val="22"/>
-          <w:lang w:val="pt-BR"/>
-        </w:rPr>
-        <w:t xml:space="preserve"> </w:t>
-      </w:r>
-      <w:r>
-        <w:rPr>
-          <w:rFonts w:cs="Arial" w:ascii="Arial" w:hAnsi="Arial"/>
+          <w:rFonts w:ascii="Arial" w:eastAsia="Arial" w:hAnsi="Arial" w:cs="Arial"/>
+          <w:sz w:val="22"/>
+          <w:szCs w:val="22"/>
+          <w:lang w:val="pt-BR"/>
+        </w:rPr>
+        <w:t xml:space="preserve"> </w:t>
+      </w:r>
+      <w:r>
+        <w:rPr>
+          <w:rFonts w:ascii="Arial" w:hAnsi="Arial" w:cs="Arial"/>
           <w:sz w:val="22"/>
           <w:szCs w:val="22"/>
           <w:lang w:val="pt-BR"/>
@@ -1131,21 +1325,29 @@
       </w:r>
       <w:r>
         <w:rPr>
-          <w:rFonts w:eastAsia="Arial" w:cs="Arial" w:ascii="Arial" w:hAnsi="Arial"/>
-          <w:sz w:val="22"/>
-          <w:szCs w:val="22"/>
-          <w:lang w:val="pt-BR"/>
-        </w:rPr>
-        <w:t xml:space="preserve"> </w:t>
-      </w:r>
-      <w:r>
-        <w:rPr>
-          <w:rFonts w:cs="Arial" w:ascii="Arial" w:hAnsi="Arial"/>
+          <w:rFonts w:ascii="Arial" w:eastAsia="Arial" w:hAnsi="Arial" w:cs="Arial"/>
+          <w:sz w:val="22"/>
+          <w:szCs w:val="22"/>
+          <w:lang w:val="pt-BR"/>
+        </w:rPr>
+        <w:t xml:space="preserve"> </w:t>
+      </w:r>
+      <w:r>
+        <w:rPr>
+          <w:rFonts w:ascii="Arial" w:hAnsi="Arial" w:cs="Arial"/>
           <w:sz w:val="22"/>
           <w:szCs w:val="22"/>
           <w:lang w:val="pt-BR"/>
         </w:rPr>
         <w:t>laterais.</w:t>
+      </w:r>
+      <w:r>
+        <w:rPr>
+          <w:rFonts w:ascii="Arial" w:hAnsi="Arial" w:cs="Arial"/>
+          <w:sz w:val="22"/>
+          <w:szCs w:val="22"/>
+          <w:lang w:val="pt-BR"/>
+        </w:rPr>
         <w:tab/>
       </w:r>
     </w:p>
@@ -1158,13 +1360,13 @@
           <w:bottom w:val="single" w:sz="4" w:space="0" w:color="000000"/>
           <w:right w:val="single" w:sz="4" w:space="4" w:color="000000"/>
         </w:pBdr>
-        <w:shd w:val="clear" w:color="auto" w:fill="D9D9D9" w:themeFill="background1" w:themeFillShade="d9"/>
-        <w:spacing w:before="200" w:after="120"/>
-        <w:ind w:left="85" w:right="130"/>
+        <w:shd w:val="clear" w:color="auto" w:fill="D9D9D9" w:themeFill="background1" w:themeFillShade="D9"/>
+        <w:spacing w:after="120"/>
+        <w:ind w:left="85"/>
         <w:jc w:val="left"/>
         <w:rPr>
           <w:rFonts w:ascii="Arial" w:hAnsi="Arial" w:cs="Arial"/>
-          <w:color w:themeColor="text1" w:val="000000"/>
+          <w:color w:val="000000" w:themeColor="text1"/>
           <w:sz w:val="24"/>
           <w:szCs w:val="24"/>
           <w:lang w:val="pt-BR"/>
@@ -1172,8 +1374,8 @@
       </w:pPr>
       <w:r>
         <w:rPr>
-          <w:rFonts w:cs="Arial" w:ascii="Arial" w:hAnsi="Arial"/>
-          <w:color w:themeColor="text1" w:val="000000"/>
+          <w:rFonts w:ascii="Arial" w:hAnsi="Arial" w:cs="Arial"/>
+          <w:color w:val="000000" w:themeColor="text1"/>
           <w:sz w:val="24"/>
           <w:szCs w:val="24"/>
           <w:lang w:val="pt-BR"/>
@@ -1183,20 +1385,23 @@
     </w:p>
     <w:p>
       <w:pPr>
+        <w:rPr>
+          <w:lang w:val="pt-BR"/>
+        </w:rPr>
         <w:sectPr>
           <w:type w:val="continuous"/>
           <w:pgSz w:w="11906" w:h="16838"/>
-          <w:pgMar w:left="1134" w:right="1134" w:gutter="0" w:header="0" w:top="709" w:footer="0" w:bottom="1134"/>
-          <w:formProt w:val="false"/>
-          <w:textDirection w:val="lrTb"/>
-          <w:docGrid w:type="default" w:linePitch="360" w:charSpace="16384"/>
+          <w:pgMar w:top="709" w:right="1134" w:bottom="1134" w:left="1134" w:header="0" w:footer="0" w:gutter="0"/>
+          <w:cols w:space="720"/>
+          <w:formProt w:val="0"/>
+          <w:docGrid w:linePitch="360" w:charSpace="16384"/>
         </w:sectPr>
       </w:pPr>
     </w:p>
     <w:p>
       <w:pPr>
         <w:pStyle w:val="TAMainText"/>
-        <w:ind w:hanging="0" w:left="86" w:right="130"/>
+        <w:ind w:left="86" w:right="130" w:firstLine="0"/>
         <w:rPr>
           <w:rFonts w:ascii="Arial" w:hAnsi="Arial" w:cs="Arial"/>
           <w:lang w:val="pt-BR"/>
@@ -1204,7 +1409,7 @@
       </w:pPr>
       <w:r>
         <w:rPr>
-          <w:rFonts w:cs="Arial" w:ascii="Arial" w:hAnsi="Arial"/>
+          <w:rFonts w:ascii="Arial" w:hAnsi="Arial" w:cs="Arial"/>
           <w:sz w:val="22"/>
           <w:szCs w:val="22"/>
           <w:lang w:val="pt-BR"/>
@@ -1213,16 +1418,16 @@
       </w:r>
       <w:r>
         <w:rPr>
-          <w:rFonts w:eastAsia="Arial" w:cs="Arial" w:ascii="Arial" w:hAnsi="Arial"/>
-          <w:sz w:val="22"/>
-          <w:szCs w:val="22"/>
-          <w:lang w:val="pt-BR"/>
-        </w:rPr>
-        <w:t xml:space="preserve"> </w:t>
-      </w:r>
-      <w:r>
-        <w:rPr>
-          <w:rFonts w:cs="Arial" w:ascii="Arial" w:hAnsi="Arial"/>
+          <w:rFonts w:ascii="Arial" w:eastAsia="Arial" w:hAnsi="Arial" w:cs="Arial"/>
+          <w:sz w:val="22"/>
+          <w:szCs w:val="22"/>
+          <w:lang w:val="pt-BR"/>
+        </w:rPr>
+        <w:t xml:space="preserve"> </w:t>
+      </w:r>
+      <w:r>
+        <w:rPr>
+          <w:rFonts w:ascii="Arial" w:hAnsi="Arial" w:cs="Arial"/>
           <w:sz w:val="22"/>
           <w:szCs w:val="22"/>
           <w:lang w:val="pt-BR"/>
@@ -1231,16 +1436,16 @@
       </w:r>
       <w:r>
         <w:rPr>
-          <w:rFonts w:eastAsia="Arial" w:cs="Arial" w:ascii="Arial" w:hAnsi="Arial"/>
-          <w:sz w:val="22"/>
-          <w:szCs w:val="22"/>
-          <w:lang w:val="pt-BR"/>
-        </w:rPr>
-        <w:t xml:space="preserve"> </w:t>
-      </w:r>
-      <w:r>
-        <w:rPr>
-          <w:rFonts w:cs="Arial" w:ascii="Arial" w:hAnsi="Arial"/>
+          <w:rFonts w:ascii="Arial" w:eastAsia="Arial" w:hAnsi="Arial" w:cs="Arial"/>
+          <w:sz w:val="22"/>
+          <w:szCs w:val="22"/>
+          <w:lang w:val="pt-BR"/>
+        </w:rPr>
+        <w:t xml:space="preserve"> </w:t>
+      </w:r>
+      <w:r>
+        <w:rPr>
+          <w:rFonts w:ascii="Arial" w:hAnsi="Arial" w:cs="Arial"/>
           <w:sz w:val="22"/>
           <w:szCs w:val="22"/>
           <w:lang w:val="pt-BR"/>
@@ -1249,16 +1454,16 @@
       </w:r>
       <w:r>
         <w:rPr>
-          <w:rFonts w:eastAsia="Arial" w:cs="Arial" w:ascii="Arial" w:hAnsi="Arial"/>
-          <w:sz w:val="22"/>
-          <w:szCs w:val="22"/>
-          <w:lang w:val="pt-BR"/>
-        </w:rPr>
-        <w:t xml:space="preserve"> </w:t>
-      </w:r>
-      <w:r>
-        <w:rPr>
-          <w:rFonts w:cs="Arial" w:ascii="Arial" w:hAnsi="Arial"/>
+          <w:rFonts w:ascii="Arial" w:eastAsia="Arial" w:hAnsi="Arial" w:cs="Arial"/>
+          <w:sz w:val="22"/>
+          <w:szCs w:val="22"/>
+          <w:lang w:val="pt-BR"/>
+        </w:rPr>
+        <w:t xml:space="preserve"> </w:t>
+      </w:r>
+      <w:r>
+        <w:rPr>
+          <w:rFonts w:ascii="Arial" w:hAnsi="Arial" w:cs="Arial"/>
           <w:sz w:val="22"/>
           <w:szCs w:val="22"/>
           <w:lang w:val="pt-BR"/>
@@ -1267,16 +1472,16 @@
       </w:r>
       <w:r>
         <w:rPr>
-          <w:rFonts w:eastAsia="Arial" w:cs="Arial" w:ascii="Arial" w:hAnsi="Arial"/>
-          <w:sz w:val="22"/>
-          <w:szCs w:val="22"/>
-          <w:lang w:val="pt-BR"/>
-        </w:rPr>
-        <w:t xml:space="preserve"> </w:t>
-      </w:r>
-      <w:r>
-        <w:rPr>
-          <w:rFonts w:cs="Arial" w:ascii="Arial" w:hAnsi="Arial"/>
+          <w:rFonts w:ascii="Arial" w:eastAsia="Arial" w:hAnsi="Arial" w:cs="Arial"/>
+          <w:sz w:val="22"/>
+          <w:szCs w:val="22"/>
+          <w:lang w:val="pt-BR"/>
+        </w:rPr>
+        <w:t xml:space="preserve"> </w:t>
+      </w:r>
+      <w:r>
+        <w:rPr>
+          <w:rFonts w:ascii="Arial" w:hAnsi="Arial" w:cs="Arial"/>
           <w:sz w:val="22"/>
           <w:szCs w:val="22"/>
           <w:lang w:val="pt-BR"/>
@@ -1285,16 +1490,16 @@
       </w:r>
       <w:r>
         <w:rPr>
-          <w:rFonts w:eastAsia="Arial" w:cs="Arial" w:ascii="Arial" w:hAnsi="Arial"/>
-          <w:sz w:val="22"/>
-          <w:szCs w:val="22"/>
-          <w:lang w:val="pt-BR"/>
-        </w:rPr>
-        <w:t xml:space="preserve"> </w:t>
-      </w:r>
-      <w:r>
-        <w:rPr>
-          <w:rFonts w:cs="Arial" w:ascii="Arial" w:hAnsi="Arial"/>
+          <w:rFonts w:ascii="Arial" w:eastAsia="Arial" w:hAnsi="Arial" w:cs="Arial"/>
+          <w:sz w:val="22"/>
+          <w:szCs w:val="22"/>
+          <w:lang w:val="pt-BR"/>
+        </w:rPr>
+        <w:t xml:space="preserve"> </w:t>
+      </w:r>
+      <w:r>
+        <w:rPr>
+          <w:rFonts w:ascii="Arial" w:hAnsi="Arial" w:cs="Arial"/>
           <w:sz w:val="22"/>
           <w:szCs w:val="22"/>
           <w:lang w:val="pt-BR"/>
@@ -1303,16 +1508,16 @@
       </w:r>
       <w:r>
         <w:rPr>
-          <w:rFonts w:eastAsia="Arial" w:cs="Arial" w:ascii="Arial" w:hAnsi="Arial"/>
-          <w:sz w:val="22"/>
-          <w:szCs w:val="22"/>
-          <w:lang w:val="pt-BR"/>
-        </w:rPr>
-        <w:t xml:space="preserve"> </w:t>
-      </w:r>
-      <w:r>
-        <w:rPr>
-          <w:rFonts w:cs="Arial" w:ascii="Arial" w:hAnsi="Arial"/>
+          <w:rFonts w:ascii="Arial" w:eastAsia="Arial" w:hAnsi="Arial" w:cs="Arial"/>
+          <w:sz w:val="22"/>
+          <w:szCs w:val="22"/>
+          <w:lang w:val="pt-BR"/>
+        </w:rPr>
+        <w:t xml:space="preserve"> </w:t>
+      </w:r>
+      <w:r>
+        <w:rPr>
+          <w:rFonts w:ascii="Arial" w:hAnsi="Arial" w:cs="Arial"/>
           <w:sz w:val="22"/>
           <w:szCs w:val="22"/>
           <w:lang w:val="pt-BR"/>
@@ -1321,16 +1526,16 @@
       </w:r>
       <w:r>
         <w:rPr>
-          <w:rFonts w:eastAsia="Arial" w:cs="Arial" w:ascii="Arial" w:hAnsi="Arial"/>
-          <w:sz w:val="22"/>
-          <w:szCs w:val="22"/>
-          <w:lang w:val="pt-BR"/>
-        </w:rPr>
-        <w:t xml:space="preserve"> </w:t>
-      </w:r>
-      <w:r>
-        <w:rPr>
-          <w:rFonts w:cs="Arial" w:ascii="Arial" w:hAnsi="Arial"/>
+          <w:rFonts w:ascii="Arial" w:eastAsia="Arial" w:hAnsi="Arial" w:cs="Arial"/>
+          <w:sz w:val="22"/>
+          <w:szCs w:val="22"/>
+          <w:lang w:val="pt-BR"/>
+        </w:rPr>
+        <w:t xml:space="preserve"> </w:t>
+      </w:r>
+      <w:r>
+        <w:rPr>
+          <w:rFonts w:ascii="Arial" w:hAnsi="Arial" w:cs="Arial"/>
           <w:sz w:val="22"/>
           <w:szCs w:val="22"/>
           <w:lang w:val="pt-BR"/>
@@ -1339,16 +1544,16 @@
       </w:r>
       <w:r>
         <w:rPr>
-          <w:rFonts w:eastAsia="Arial" w:cs="Arial" w:ascii="Arial" w:hAnsi="Arial"/>
-          <w:sz w:val="22"/>
-          <w:szCs w:val="22"/>
-          <w:lang w:val="pt-BR"/>
-        </w:rPr>
-        <w:t xml:space="preserve"> </w:t>
-      </w:r>
-      <w:r>
-        <w:rPr>
-          <w:rFonts w:cs="Arial" w:ascii="Arial" w:hAnsi="Arial"/>
+          <w:rFonts w:ascii="Arial" w:eastAsia="Arial" w:hAnsi="Arial" w:cs="Arial"/>
+          <w:sz w:val="22"/>
+          <w:szCs w:val="22"/>
+          <w:lang w:val="pt-BR"/>
+        </w:rPr>
+        <w:t xml:space="preserve"> </w:t>
+      </w:r>
+      <w:r>
+        <w:rPr>
+          <w:rFonts w:ascii="Arial" w:hAnsi="Arial" w:cs="Arial"/>
           <w:sz w:val="22"/>
           <w:szCs w:val="22"/>
           <w:lang w:val="pt-BR"/>
@@ -1357,16 +1562,16 @@
       </w:r>
       <w:r>
         <w:rPr>
-          <w:rFonts w:eastAsia="Arial" w:cs="Arial" w:ascii="Arial" w:hAnsi="Arial"/>
-          <w:sz w:val="22"/>
-          <w:szCs w:val="22"/>
-          <w:lang w:val="pt-BR"/>
-        </w:rPr>
-        <w:t xml:space="preserve"> </w:t>
-      </w:r>
-      <w:r>
-        <w:rPr>
-          <w:rFonts w:cs="Arial" w:ascii="Arial" w:hAnsi="Arial"/>
+          <w:rFonts w:ascii="Arial" w:eastAsia="Arial" w:hAnsi="Arial" w:cs="Arial"/>
+          <w:sz w:val="22"/>
+          <w:szCs w:val="22"/>
+          <w:lang w:val="pt-BR"/>
+        </w:rPr>
+        <w:t xml:space="preserve"> </w:t>
+      </w:r>
+      <w:r>
+        <w:rPr>
+          <w:rFonts w:ascii="Arial" w:hAnsi="Arial" w:cs="Arial"/>
           <w:sz w:val="22"/>
           <w:szCs w:val="22"/>
           <w:lang w:val="pt-BR"/>
@@ -1375,16 +1580,16 @@
       </w:r>
       <w:r>
         <w:rPr>
-          <w:rFonts w:eastAsia="Arial" w:cs="Arial" w:ascii="Arial" w:hAnsi="Arial"/>
-          <w:sz w:val="22"/>
-          <w:szCs w:val="22"/>
-          <w:lang w:val="pt-BR"/>
-        </w:rPr>
-        <w:t xml:space="preserve"> </w:t>
-      </w:r>
-      <w:r>
-        <w:rPr>
-          <w:rFonts w:cs="Arial" w:ascii="Arial" w:hAnsi="Arial"/>
+          <w:rFonts w:ascii="Arial" w:eastAsia="Arial" w:hAnsi="Arial" w:cs="Arial"/>
+          <w:sz w:val="22"/>
+          <w:szCs w:val="22"/>
+          <w:lang w:val="pt-BR"/>
+        </w:rPr>
+        <w:t xml:space="preserve"> </w:t>
+      </w:r>
+      <w:r>
+        <w:rPr>
+          <w:rFonts w:ascii="Arial" w:hAnsi="Arial" w:cs="Arial"/>
           <w:sz w:val="22"/>
           <w:szCs w:val="22"/>
           <w:lang w:val="pt-BR"/>
@@ -1393,7 +1598,7 @@
       </w:r>
       <w:r>
         <w:rPr>
-          <w:rFonts w:eastAsia="Arial" w:cs="Arial" w:ascii="Arial" w:hAnsi="Arial"/>
+          <w:rFonts w:ascii="Arial" w:eastAsia="Arial" w:hAnsi="Arial" w:cs="Arial"/>
           <w:sz w:val="22"/>
           <w:szCs w:val="22"/>
           <w:lang w:val="pt-BR"/>
@@ -1402,7 +1607,7 @@
       </w:r>
       <w:r>
         <w:rPr>
-          <w:rFonts w:cs="Arial" w:ascii="Arial" w:hAnsi="Arial"/>
+          <w:rFonts w:ascii="Arial" w:hAnsi="Arial" w:cs="Arial"/>
           <w:sz w:val="22"/>
           <w:szCs w:val="22"/>
           <w:lang w:val="pt-BR"/>
@@ -1411,16 +1616,16 @@
       </w:r>
       <w:r>
         <w:rPr>
-          <w:rFonts w:eastAsia="Arial" w:cs="Arial" w:ascii="Arial" w:hAnsi="Arial"/>
-          <w:sz w:val="22"/>
-          <w:szCs w:val="22"/>
-          <w:lang w:val="pt-BR"/>
-        </w:rPr>
-        <w:t xml:space="preserve"> </w:t>
-      </w:r>
-      <w:r>
-        <w:rPr>
-          <w:rFonts w:cs="Arial" w:ascii="Arial" w:hAnsi="Arial"/>
+          <w:rFonts w:ascii="Arial" w:eastAsia="Arial" w:hAnsi="Arial" w:cs="Arial"/>
+          <w:sz w:val="22"/>
+          <w:szCs w:val="22"/>
+          <w:lang w:val="pt-BR"/>
+        </w:rPr>
+        <w:t xml:space="preserve"> </w:t>
+      </w:r>
+      <w:r>
+        <w:rPr>
+          <w:rFonts w:ascii="Arial" w:hAnsi="Arial" w:cs="Arial"/>
           <w:sz w:val="22"/>
           <w:szCs w:val="22"/>
           <w:lang w:val="pt-BR"/>
@@ -1429,16 +1634,16 @@
       </w:r>
       <w:r>
         <w:rPr>
-          <w:rFonts w:eastAsia="Arial" w:cs="Arial" w:ascii="Arial" w:hAnsi="Arial"/>
-          <w:sz w:val="22"/>
-          <w:szCs w:val="22"/>
-          <w:lang w:val="pt-BR"/>
-        </w:rPr>
-        <w:t xml:space="preserve"> </w:t>
-      </w:r>
-      <w:r>
-        <w:rPr>
-          <w:rFonts w:cs="Arial" w:ascii="Arial" w:hAnsi="Arial"/>
+          <w:rFonts w:ascii="Arial" w:eastAsia="Arial" w:hAnsi="Arial" w:cs="Arial"/>
+          <w:sz w:val="22"/>
+          <w:szCs w:val="22"/>
+          <w:lang w:val="pt-BR"/>
+        </w:rPr>
+        <w:t xml:space="preserve"> </w:t>
+      </w:r>
+      <w:r>
+        <w:rPr>
+          <w:rFonts w:ascii="Arial" w:hAnsi="Arial" w:cs="Arial"/>
           <w:sz w:val="22"/>
           <w:szCs w:val="22"/>
           <w:lang w:val="pt-BR"/>
@@ -1447,16 +1652,16 @@
       </w:r>
       <w:r>
         <w:rPr>
-          <w:rFonts w:eastAsia="Arial" w:cs="Arial" w:ascii="Arial" w:hAnsi="Arial"/>
-          <w:sz w:val="22"/>
-          <w:szCs w:val="22"/>
-          <w:lang w:val="pt-BR"/>
-        </w:rPr>
-        <w:t xml:space="preserve"> </w:t>
-      </w:r>
-      <w:r>
-        <w:rPr>
-          <w:rFonts w:cs="Arial" w:ascii="Arial" w:hAnsi="Arial"/>
+          <w:rFonts w:ascii="Arial" w:eastAsia="Arial" w:hAnsi="Arial" w:cs="Arial"/>
+          <w:sz w:val="22"/>
+          <w:szCs w:val="22"/>
+          <w:lang w:val="pt-BR"/>
+        </w:rPr>
+        <w:t xml:space="preserve"> </w:t>
+      </w:r>
+      <w:r>
+        <w:rPr>
+          <w:rFonts w:ascii="Arial" w:hAnsi="Arial" w:cs="Arial"/>
           <w:sz w:val="22"/>
           <w:szCs w:val="22"/>
           <w:lang w:val="pt-BR"/>
@@ -1465,16 +1670,16 @@
       </w:r>
       <w:r>
         <w:rPr>
-          <w:rFonts w:eastAsia="Arial" w:cs="Arial" w:ascii="Arial" w:hAnsi="Arial"/>
-          <w:sz w:val="22"/>
-          <w:szCs w:val="22"/>
-          <w:lang w:val="pt-BR"/>
-        </w:rPr>
-        <w:t xml:space="preserve"> </w:t>
-      </w:r>
-      <w:r>
-        <w:rPr>
-          <w:rFonts w:cs="Arial" w:ascii="Arial" w:hAnsi="Arial"/>
+          <w:rFonts w:ascii="Arial" w:eastAsia="Arial" w:hAnsi="Arial" w:cs="Arial"/>
+          <w:sz w:val="22"/>
+          <w:szCs w:val="22"/>
+          <w:lang w:val="pt-BR"/>
+        </w:rPr>
+        <w:t xml:space="preserve"> </w:t>
+      </w:r>
+      <w:r>
+        <w:rPr>
+          <w:rFonts w:ascii="Arial" w:hAnsi="Arial" w:cs="Arial"/>
           <w:sz w:val="22"/>
           <w:szCs w:val="22"/>
           <w:lang w:val="pt-BR"/>
@@ -1483,16 +1688,16 @@
       </w:r>
       <w:r>
         <w:rPr>
-          <w:rFonts w:eastAsia="Arial" w:cs="Arial" w:ascii="Arial" w:hAnsi="Arial"/>
-          <w:sz w:val="22"/>
-          <w:szCs w:val="22"/>
-          <w:lang w:val="pt-BR"/>
-        </w:rPr>
-        <w:t xml:space="preserve"> </w:t>
-      </w:r>
-      <w:r>
-        <w:rPr>
-          <w:rFonts w:cs="Arial" w:ascii="Arial" w:hAnsi="Arial"/>
+          <w:rFonts w:ascii="Arial" w:eastAsia="Arial" w:hAnsi="Arial" w:cs="Arial"/>
+          <w:sz w:val="22"/>
+          <w:szCs w:val="22"/>
+          <w:lang w:val="pt-BR"/>
+        </w:rPr>
+        <w:t xml:space="preserve"> </w:t>
+      </w:r>
+      <w:r>
+        <w:rPr>
+          <w:rFonts w:ascii="Arial" w:hAnsi="Arial" w:cs="Arial"/>
           <w:sz w:val="22"/>
           <w:szCs w:val="22"/>
           <w:lang w:val="pt-BR"/>
@@ -1501,48 +1706,56 @@
       </w:r>
       <w:r>
         <w:rPr>
-          <w:rFonts w:eastAsia="Arial" w:cs="Arial" w:ascii="Arial" w:hAnsi="Arial"/>
-          <w:sz w:val="22"/>
-          <w:szCs w:val="22"/>
-          <w:lang w:val="pt-BR"/>
-        </w:rPr>
-        <w:t xml:space="preserve"> </w:t>
-      </w:r>
-      <w:r>
-        <w:rPr>
-          <w:rFonts w:cs="Arial" w:ascii="Arial" w:hAnsi="Arial"/>
+          <w:rFonts w:ascii="Arial" w:eastAsia="Arial" w:hAnsi="Arial" w:cs="Arial"/>
+          <w:sz w:val="22"/>
+          <w:szCs w:val="22"/>
+          <w:lang w:val="pt-BR"/>
+        </w:rPr>
+        <w:t xml:space="preserve"> </w:t>
+      </w:r>
+      <w:r>
+        <w:rPr>
+          <w:rFonts w:ascii="Arial" w:hAnsi="Arial" w:cs="Arial"/>
           <w:sz w:val="22"/>
           <w:szCs w:val="22"/>
           <w:lang w:val="pt-BR"/>
         </w:rPr>
         <w:t xml:space="preserve">laterais. </w:t>
+      </w:r>
+      <w:r>
+        <w:rPr>
+          <w:rFonts w:ascii="Arial" w:hAnsi="Arial" w:cs="Arial"/>
+          <w:sz w:val="22"/>
+          <w:szCs w:val="22"/>
+          <w:lang w:val="pt-BR"/>
+        </w:rPr>
         <w:tab/>
       </w:r>
     </w:p>
     <w:sectPr>
       <w:type w:val="continuous"/>
       <w:pgSz w:w="11906" w:h="16838"/>
-      <w:pgMar w:left="1134" w:right="1134" w:gutter="0" w:header="0" w:top="709" w:footer="0" w:bottom="1134"/>
-      <w:formProt w:val="false"/>
-      <w:textDirection w:val="lrTb"/>
-      <w:docGrid w:type="default" w:linePitch="360" w:charSpace="16384"/>
+      <w:pgMar w:top="709" w:right="1134" w:bottom="1134" w:left="1134" w:header="0" w:footer="0" w:gutter="0"/>
+      <w:cols w:space="720"/>
+      <w:formProt w:val="0"/>
+      <w:docGrid w:linePitch="360" w:charSpace="16384"/>
     </w:sectPr>
   </w:body>
 </w:document>
 </file>
 
 <file path=word/styles.xml><?xml version="1.0" encoding="utf-8"?>
-<w:styles xmlns:w="http://schemas.openxmlformats.org/wordprocessingml/2006/main" xmlns:w14="http://schemas.microsoft.com/office/word/2010/wordml" xmlns:mc="http://schemas.openxmlformats.org/markup-compatibility/2006" mc:Ignorable="w14">
+<w:styles xmlns:mc="http://schemas.openxmlformats.org/markup-compatibility/2006" xmlns:r="http://schemas.openxmlformats.org/officeDocument/2006/relationships" xmlns:w="http://schemas.openxmlformats.org/wordprocessingml/2006/main" xmlns:w14="http://schemas.microsoft.com/office/word/2010/wordml" xmlns:w15="http://schemas.microsoft.com/office/word/2012/wordml" xmlns:w16cex="http://schemas.microsoft.com/office/word/2018/wordml/cex" xmlns:w16cid="http://schemas.microsoft.com/office/word/2016/wordml/cid" xmlns:w16="http://schemas.microsoft.com/office/word/2018/wordml" xmlns:w16du="http://schemas.microsoft.com/office/word/2023/wordml/word16du" xmlns:w16sdtdh="http://schemas.microsoft.com/office/word/2020/wordml/sdtdatahash" xmlns:w16sdtfl="http://schemas.microsoft.com/office/word/2024/wordml/sdtformatlock" xmlns:w16se="http://schemas.microsoft.com/office/word/2015/wordml/symex" mc:Ignorable="w14 w15 w16se w16cid w16 w16cex w16sdtdh w16sdtfl w16du">
   <w:docDefaults>
     <w:rPrDefault>
       <w:rPr>
-        <w:rFonts w:ascii="Times New Roman" w:hAnsi="Times New Roman" w:eastAsia="Times New Roman" w:cs="Times New Roman"/>
+        <w:rFonts w:ascii="Times New Roman" w:eastAsia="Times New Roman" w:hAnsi="Times New Roman" w:cs="Times New Roman"/>
         <w:lang w:val="pt-BR" w:eastAsia="pt-BR" w:bidi="ar-SA"/>
       </w:rPr>
     </w:rPrDefault>
     <w:pPrDefault>
       <w:pPr>
-        <w:suppressAutoHyphens w:val="true"/>
+        <w:suppressAutoHyphens/>
       </w:pPr>
     </w:pPrDefault>
   </w:docDefaults>
@@ -1579,7 +1792,7 @@
     <w:lsdException w:name="footnote text" w:semiHidden="1" w:unhideWhenUsed="1"/>
     <w:lsdException w:name="annotation text" w:semiHidden="1" w:unhideWhenUsed="1"/>
     <w:lsdException w:name="header" w:semiHidden="1" w:unhideWhenUsed="1"/>
-    <w:lsdException w:name="footer" w:uiPriority="99" w:semiHidden="1" w:unhideWhenUsed="1"/>
+    <w:lsdException w:name="footer" w:semiHidden="1" w:uiPriority="99" w:unhideWhenUsed="1"/>
     <w:lsdException w:name="index heading" w:semiHidden="1" w:unhideWhenUsed="1"/>
     <w:lsdException w:name="caption" w:semiHidden="1" w:unhideWhenUsed="1" w:qFormat="1"/>
     <w:lsdException w:name="table of figures" w:semiHidden="1" w:unhideWhenUsed="1"/>
@@ -1635,7 +1848,7 @@
     <w:lsdException w:name="E-mail Signature" w:semiHidden="1" w:unhideWhenUsed="1"/>
     <w:lsdException w:name="HTML Top of Form" w:semiHidden="1" w:unhideWhenUsed="1"/>
     <w:lsdException w:name="HTML Bottom of Form" w:semiHidden="1" w:unhideWhenUsed="1"/>
-    <w:lsdException w:name="Normal (Web)" w:uiPriority="99" w:semiHidden="1" w:unhideWhenUsed="1"/>
+    <w:lsdException w:name="Normal (Web)" w:semiHidden="1" w:uiPriority="99" w:unhideWhenUsed="1"/>
     <w:lsdException w:name="HTML Acronym" w:semiHidden="1" w:unhideWhenUsed="1"/>
     <w:lsdException w:name="HTML Address" w:semiHidden="1" w:unhideWhenUsed="1"/>
     <w:lsdException w:name="HTML Cite" w:semiHidden="1" w:unhideWhenUsed="1"/>
@@ -1696,7 +1909,7 @@
     <w:lsdException w:name="Table Web 3" w:semiHidden="1" w:unhideWhenUsed="1"/>
     <w:lsdException w:name="Balloon Text" w:semiHidden="1" w:unhideWhenUsed="1"/>
     <w:lsdException w:name="Table Theme" w:semiHidden="1" w:unhideWhenUsed="1"/>
-    <w:lsdException w:name="Placeholder Text" w:uiPriority="99" w:semiHidden="1"/>
+    <w:lsdException w:name="Placeholder Text" w:semiHidden="1" w:uiPriority="99"/>
     <w:lsdException w:name="No Spacing" w:uiPriority="1" w:qFormat="1"/>
     <w:lsdException w:name="Light Shading" w:uiPriority="60"/>
     <w:lsdException w:name="Light List" w:uiPriority="61"/>
@@ -1718,7 +1931,7 @@
     <w:lsdException w:name="Medium Shading 1 Accent 1" w:uiPriority="63"/>
     <w:lsdException w:name="Medium Shading 2 Accent 1" w:uiPriority="64"/>
     <w:lsdException w:name="Medium List 1 Accent 1" w:uiPriority="65"/>
-    <w:lsdException w:name="Revision" w:uiPriority="99" w:semiHidden="1"/>
+    <w:lsdException w:name="Revision" w:semiHidden="1" w:uiPriority="99"/>
     <w:lsdException w:name="List Paragraph" w:uiPriority="34" w:qFormat="1"/>
     <w:lsdException w:name="Quote" w:uiPriority="29" w:qFormat="1"/>
     <w:lsdException w:name="Intense Quote" w:uiPriority="30" w:qFormat="1"/>
@@ -1805,8 +2018,8 @@
     <w:lsdException w:name="Subtle Reference" w:uiPriority="31" w:qFormat="1"/>
     <w:lsdException w:name="Intense Reference" w:uiPriority="32" w:qFormat="1"/>
     <w:lsdException w:name="Book Title" w:uiPriority="33" w:qFormat="1"/>
-    <w:lsdException w:name="Bibliography" w:uiPriority="37" w:semiHidden="1" w:unhideWhenUsed="1"/>
-    <w:lsdException w:name="TOC Heading" w:uiPriority="39" w:semiHidden="1" w:unhideWhenUsed="1" w:qFormat="1"/>
+    <w:lsdException w:name="Bibliography" w:semiHidden="1" w:uiPriority="37" w:unhideWhenUsed="1"/>
+    <w:lsdException w:name="TOC Heading" w:semiHidden="1" w:uiPriority="39" w:unhideWhenUsed="1" w:qFormat="1"/>
     <w:lsdException w:name="Plain Table 1" w:uiPriority="41"/>
     <w:lsdException w:name="Plain Table 2" w:uiPriority="42"/>
     <w:lsdException w:name="Plain Table 3" w:uiPriority="43"/>
@@ -1911,45 +2124,35 @@
     <w:lsdException w:name="List Table 5 Dark Accent 6" w:uiPriority="50"/>
     <w:lsdException w:name="List Table 6 Colorful Accent 6" w:uiPriority="51"/>
     <w:lsdException w:name="List Table 7 Colorful Accent 6" w:uiPriority="52"/>
-    <w:lsdException w:name="Mention" w:uiPriority="99" w:semiHidden="1" w:unhideWhenUsed="1"/>
-    <w:lsdException w:name="Smart Hyperlink" w:uiPriority="99" w:semiHidden="1" w:unhideWhenUsed="1"/>
-    <w:lsdException w:name="Hashtag" w:uiPriority="99" w:semiHidden="1" w:unhideWhenUsed="1"/>
-    <w:lsdException w:name="Unresolved Mention" w:uiPriority="99" w:semiHidden="1" w:unhideWhenUsed="1"/>
-    <w:lsdException w:name="Smart Link" w:uiPriority="99" w:semiHidden="1" w:unhideWhenUsed="1"/>
+    <w:lsdException w:name="Mention" w:semiHidden="1" w:uiPriority="99" w:unhideWhenUsed="1"/>
+    <w:lsdException w:name="Smart Hyperlink" w:semiHidden="1" w:uiPriority="99" w:unhideWhenUsed="1"/>
+    <w:lsdException w:name="Hashtag" w:semiHidden="1" w:uiPriority="99" w:unhideWhenUsed="1"/>
+    <w:lsdException w:name="Unresolved Mention" w:semiHidden="1" w:uiPriority="99" w:unhideWhenUsed="1"/>
+    <w:lsdException w:name="Smart Link" w:semiHidden="1" w:uiPriority="99" w:unhideWhenUsed="1"/>
   </w:latentStyles>
-  <w:style w:type="paragraph" w:styleId="Normal" w:default="1">
+  <w:style w:type="paragraph" w:default="1" w:styleId="Normal">
     <w:name w:val="Normal"/>
     <w:qFormat/>
     <w:pPr>
-      <w:widowControl/>
-      <w:suppressAutoHyphens w:val="true"/>
-      <w:bidi w:val="0"/>
-      <w:spacing w:before="0" w:after="0"/>
-      <w:jc w:val="left"/>
       <w:textAlignment w:val="baseline"/>
     </w:pPr>
     <w:rPr>
-      <w:rFonts w:ascii="Helvetica" w:hAnsi="Helvetica" w:cs="Helvetica" w:eastAsia="Times New Roman"/>
-      <w:color w:val="auto"/>
-      <w:kern w:val="0"/>
-      <w:sz w:val="20"/>
-      <w:szCs w:val="20"/>
-      <w:lang w:val="en-US" w:eastAsia="ar-SA" w:bidi="ar-SA"/>
-    </w:rPr>
-  </w:style>
-  <w:style w:type="paragraph" w:styleId="Heading2">
-    <w:name w:val="Heading 2"/>
+      <w:rFonts w:ascii="Helvetica" w:hAnsi="Helvetica" w:cs="Helvetica"/>
+      <w:lang w:val="en-US" w:eastAsia="ar-SA"/>
+    </w:rPr>
+  </w:style>
+  <w:style w:type="paragraph" w:styleId="Ttulo2">
+    <w:name w:val="heading 2"/>
     <w:basedOn w:val="Normal"/>
     <w:next w:val="Normal"/>
     <w:qFormat/>
     <w:pPr>
-      <w:keepNext w:val="true"/>
+      <w:keepNext/>
       <w:tabs>
-        <w:tab w:val="clear" w:pos="720"/>
-        <w:tab w:val="left" w:pos="0" w:leader="none"/>
+        <w:tab w:val="left" w:pos="0"/>
       </w:tabs>
       <w:spacing w:before="240" w:after="60"/>
-      <w:ind w:hanging="576" w:left="576"/>
+      <w:ind w:left="576" w:hanging="576"/>
       <w:jc w:val="both"/>
       <w:outlineLvl w:val="1"/>
     </w:pPr>
@@ -1961,19 +2164,18 @@
       <w:iCs/>
     </w:rPr>
   </w:style>
-  <w:style w:type="paragraph" w:styleId="Heading3">
-    <w:name w:val="Heading 3"/>
+  <w:style w:type="paragraph" w:styleId="Ttulo3">
+    <w:name w:val="heading 3"/>
     <w:basedOn w:val="Normal"/>
     <w:next w:val="Normal"/>
     <w:qFormat/>
     <w:pPr>
-      <w:keepNext w:val="true"/>
+      <w:keepNext/>
       <w:tabs>
-        <w:tab w:val="clear" w:pos="720"/>
-        <w:tab w:val="left" w:pos="0" w:leader="none"/>
+        <w:tab w:val="left" w:pos="0"/>
       </w:tabs>
       <w:spacing w:before="240" w:after="60"/>
-      <w:ind w:hanging="720" w:left="720"/>
+      <w:ind w:left="720" w:hanging="720"/>
       <w:jc w:val="both"/>
       <w:outlineLvl w:val="2"/>
     </w:pPr>
@@ -1981,73 +2183,87 @@
       <w:rFonts w:ascii="Arial" w:hAnsi="Arial" w:cs="Arial"/>
     </w:rPr>
   </w:style>
-  <w:style w:type="character" w:styleId="DefaultParagraphFont" w:default="1">
+  <w:style w:type="character" w:default="1" w:styleId="Fontepargpadro">
     <w:name w:val="Default Paragraph Font"/>
     <w:uiPriority w:val="1"/>
+    <w:semiHidden/>
     <w:unhideWhenUsed/>
-    <w:qFormat/>
-    <w:rPr/>
-  </w:style>
-  <w:style w:type="character" w:styleId="Fontepargpadro4" w:customStyle="1">
+  </w:style>
+  <w:style w:type="table" w:default="1" w:styleId="Tabelanormal">
+    <w:name w:val="Normal Table"/>
+    <w:uiPriority w:val="99"/>
+    <w:semiHidden/>
+    <w:unhideWhenUsed/>
+    <w:tblPr>
+      <w:tblInd w:w="0" w:type="dxa"/>
+      <w:tblCellMar>
+        <w:top w:w="0" w:type="dxa"/>
+        <w:left w:w="108" w:type="dxa"/>
+        <w:bottom w:w="0" w:type="dxa"/>
+        <w:right w:w="108" w:type="dxa"/>
+      </w:tblCellMar>
+    </w:tblPr>
+  </w:style>
+  <w:style w:type="numbering" w:default="1" w:styleId="Semlista">
+    <w:name w:val="No List"/>
+    <w:uiPriority w:val="99"/>
+    <w:semiHidden/>
+    <w:unhideWhenUsed/>
+  </w:style>
+  <w:style w:type="character" w:customStyle="1" w:styleId="Fontepargpadro4">
     <w:name w:val="Fonte parág. padrão4"/>
     <w:qFormat/>
-    <w:rPr/>
-  </w:style>
-  <w:style w:type="character" w:styleId="Fontepargpadro3" w:customStyle="1">
+  </w:style>
+  <w:style w:type="character" w:customStyle="1" w:styleId="Fontepargpadro3">
     <w:name w:val="Fonte parág. padrão3"/>
     <w:qFormat/>
-    <w:rPr/>
-  </w:style>
-  <w:style w:type="character" w:styleId="Absatz-Standardschriftart" w:customStyle="1">
+  </w:style>
+  <w:style w:type="character" w:customStyle="1" w:styleId="Absatz-Standardschriftart">
     <w:name w:val="Absatz-Standardschriftart"/>
     <w:qFormat/>
-    <w:rPr/>
-  </w:style>
-  <w:style w:type="character" w:styleId="Fontepargpadro2" w:customStyle="1">
+  </w:style>
+  <w:style w:type="character" w:customStyle="1" w:styleId="Fontepargpadro2">
     <w:name w:val="Fonte parág. padrão2"/>
     <w:qFormat/>
-    <w:rPr/>
-  </w:style>
-  <w:style w:type="character" w:styleId="Fontepargpadro1" w:customStyle="1">
+  </w:style>
+  <w:style w:type="character" w:customStyle="1" w:styleId="Fontepargpadro1">
     <w:name w:val="Fonte parág. padrão1"/>
     <w:qFormat/>
-    <w:rPr/>
-  </w:style>
-  <w:style w:type="character" w:styleId="Caracteresdenotadefim" w:customStyle="1">
+  </w:style>
+  <w:style w:type="character" w:customStyle="1" w:styleId="Caracteresdenotadefim">
     <w:name w:val="Caracteres de nota de fim"/>
     <w:qFormat/>
     <w:rPr>
       <w:vertAlign w:val="superscript"/>
     </w:rPr>
   </w:style>
-  <w:style w:type="character" w:styleId="Caracteresdenotaderodap" w:customStyle="1">
+  <w:style w:type="character" w:customStyle="1" w:styleId="Caracteresdenotaderodap">
     <w:name w:val="Caracteres de nota de rodapé"/>
     <w:qFormat/>
     <w:rPr>
       <w:vertAlign w:val="superscript"/>
     </w:rPr>
   </w:style>
-  <w:style w:type="character" w:styleId="Hyperlink" w:customStyle="1">
-    <w:name w:val="Hyperlink"/>
+  <w:style w:type="character" w:customStyle="1" w:styleId="Hyperlink1">
+    <w:name w:val="Hyperlink1"/>
     <w:rPr>
       <w:color w:val="0000FF"/>
       <w:u w:val="single"/>
     </w:rPr>
   </w:style>
-  <w:style w:type="character" w:styleId="FollowedHyperlink" w:customStyle="1">
-    <w:name w:val="FollowedHyperlink"/>
+  <w:style w:type="character" w:customStyle="1" w:styleId="HiperlinkVisitado1">
+    <w:name w:val="HiperlinkVisitado1"/>
     <w:rPr>
       <w:color w:val="800080"/>
       <w:u w:val="single"/>
     </w:rPr>
   </w:style>
-  <w:style w:type="character" w:styleId="PageNumber">
-    <w:name w:val="Page Number"/>
+  <w:style w:type="character" w:styleId="Nmerodepgina">
+    <w:name w:val="page number"/>
     <w:basedOn w:val="Fontepargpadro1"/>
     <w:qFormat/>
-    <w:rPr/>
-  </w:style>
-  <w:style w:type="character" w:styleId="Strong">
+  </w:style>
+  <w:style w:type="character" w:styleId="Forte">
     <w:name w:val="Strong"/>
     <w:qFormat/>
     <w:rPr>
@@ -2055,49 +2271,48 @@
       <w:bCs/>
     </w:rPr>
   </w:style>
-  <w:style w:type="character" w:styleId="RodapChar" w:customStyle="1">
+  <w:style w:type="character" w:customStyle="1" w:styleId="RodapChar">
     <w:name w:val="Rodapé Char"/>
+    <w:link w:val="Rodap"/>
     <w:uiPriority w:val="99"/>
     <w:qFormat/>
-    <w:rsid w:val="001c2c48"/>
+    <w:rsid w:val="001C2C48"/>
     <w:rPr>
       <w:rFonts w:ascii="Helvetica" w:hAnsi="Helvetica" w:cs="Helvetica"/>
       <w:lang w:val="en-US" w:eastAsia="ar-SA"/>
     </w:rPr>
   </w:style>
   <w:style w:type="paragraph" w:styleId="Ttulo">
-    <w:name w:val="Título"/>
-    <w:basedOn w:val="Normal"/>
-    <w:next w:val="BodyText"/>
-    <w:qFormat/>
-    <w:pPr>
-      <w:keepNext w:val="true"/>
+    <w:name w:val="Title"/>
+    <w:basedOn w:val="Normal"/>
+    <w:next w:val="Corpodetexto"/>
+    <w:qFormat/>
+    <w:pPr>
+      <w:keepNext/>
       <w:spacing w:before="240" w:after="120"/>
     </w:pPr>
     <w:rPr>
-      <w:rFonts w:ascii="Liberation Sans" w:hAnsi="Liberation Sans" w:eastAsia="Noto Sans CJK SC" w:cs="Noto Sans Devanagari"/>
+      <w:rFonts w:ascii="Liberation Sans" w:eastAsia="Microsoft YaHei" w:hAnsi="Liberation Sans" w:cs="Lucida Sans"/>
       <w:sz w:val="28"/>
       <w:szCs w:val="28"/>
     </w:rPr>
   </w:style>
-  <w:style w:type="paragraph" w:styleId="BodyText">
+  <w:style w:type="paragraph" w:styleId="Corpodetexto">
     <w:name w:val="Body Text"/>
     <w:basedOn w:val="Normal"/>
     <w:pPr>
       <w:jc w:val="both"/>
     </w:pPr>
-    <w:rPr/>
-  </w:style>
-  <w:style w:type="paragraph" w:styleId="List">
+  </w:style>
+  <w:style w:type="paragraph" w:styleId="Lista">
     <w:name w:val="List"/>
-    <w:basedOn w:val="BodyText"/>
-    <w:pPr/>
+    <w:basedOn w:val="Corpodetexto"/>
     <w:rPr>
       <w:rFonts w:ascii="Calibri" w:hAnsi="Calibri" w:cs="Mangal"/>
     </w:rPr>
   </w:style>
-  <w:style w:type="paragraph" w:styleId="Caption">
-    <w:name w:val="Caption"/>
+  <w:style w:type="paragraph" w:styleId="Legenda">
+    <w:name w:val="caption"/>
     <w:basedOn w:val="Normal"/>
     <w:qFormat/>
     <w:pPr>
@@ -2112,7 +2327,7 @@
       <w:szCs w:val="24"/>
     </w:rPr>
   </w:style>
-  <w:style w:type="paragraph" w:styleId="ndice" w:customStyle="1">
+  <w:style w:type="paragraph" w:customStyle="1" w:styleId="ndice">
     <w:name w:val="Índice"/>
     <w:basedOn w:val="Normal"/>
     <w:qFormat/>
@@ -2123,37 +2338,22 @@
       <w:rFonts w:ascii="Calibri" w:hAnsi="Calibri" w:cs="Mangal"/>
     </w:rPr>
   </w:style>
-  <w:style w:type="paragraph" w:styleId="Title">
-    <w:name w:val="Title"/>
-    <w:basedOn w:val="Normal"/>
-    <w:next w:val="BodyText"/>
-    <w:qFormat/>
-    <w:pPr>
-      <w:keepNext w:val="true"/>
+  <w:style w:type="paragraph" w:customStyle="1" w:styleId="Ttulo4">
+    <w:name w:val="Título4"/>
+    <w:basedOn w:val="Normal"/>
+    <w:next w:val="Corpodetexto"/>
+    <w:qFormat/>
+    <w:pPr>
+      <w:keepNext/>
       <w:spacing w:before="240" w:after="120"/>
     </w:pPr>
     <w:rPr>
-      <w:rFonts w:ascii="Liberation Sans" w:hAnsi="Liberation Sans" w:eastAsia="Microsoft YaHei" w:cs="Lucida Sans"/>
+      <w:rFonts w:ascii="Arial" w:eastAsia="Lucida Sans Unicode" w:hAnsi="Arial" w:cs="Tahoma"/>
       <w:sz w:val="28"/>
       <w:szCs w:val="28"/>
     </w:rPr>
   </w:style>
-  <w:style w:type="paragraph" w:styleId="Ttulo4" w:customStyle="1">
-    <w:name w:val="Título4"/>
-    <w:basedOn w:val="Normal"/>
-    <w:next w:val="BodyText"/>
-    <w:qFormat/>
-    <w:pPr>
-      <w:keepNext w:val="true"/>
-      <w:spacing w:before="240" w:after="120"/>
-    </w:pPr>
-    <w:rPr>
-      <w:rFonts w:ascii="Arial" w:hAnsi="Arial" w:eastAsia="Lucida Sans Unicode" w:cs="Tahoma"/>
-      <w:sz w:val="28"/>
-      <w:szCs w:val="28"/>
-    </w:rPr>
-  </w:style>
-  <w:style w:type="paragraph" w:styleId="Legenda3" w:customStyle="1">
+  <w:style w:type="paragraph" w:customStyle="1" w:styleId="Legenda3">
     <w:name w:val="Legenda3"/>
     <w:basedOn w:val="Normal"/>
     <w:qFormat/>
@@ -2169,37 +2369,37 @@
       <w:szCs w:val="24"/>
     </w:rPr>
   </w:style>
-  <w:style w:type="paragraph" w:styleId="Ttulo3" w:customStyle="1">
+  <w:style w:type="paragraph" w:customStyle="1" w:styleId="Ttulo30">
     <w:name w:val="Título3"/>
     <w:basedOn w:val="Normal"/>
-    <w:next w:val="BodyText"/>
-    <w:qFormat/>
-    <w:pPr>
-      <w:keepNext w:val="true"/>
+    <w:next w:val="Corpodetexto"/>
+    <w:qFormat/>
+    <w:pPr>
+      <w:keepNext/>
       <w:spacing w:before="240" w:after="120"/>
     </w:pPr>
     <w:rPr>
-      <w:rFonts w:ascii="Arial" w:hAnsi="Arial" w:eastAsia="SimSun" w:cs="Mangal"/>
+      <w:rFonts w:ascii="Arial" w:eastAsia="SimSun" w:hAnsi="Arial" w:cs="Mangal"/>
       <w:sz w:val="28"/>
       <w:szCs w:val="28"/>
     </w:rPr>
   </w:style>
-  <w:style w:type="paragraph" w:styleId="Ttulo2" w:customStyle="1">
+  <w:style w:type="paragraph" w:customStyle="1" w:styleId="Ttulo20">
     <w:name w:val="Título2"/>
     <w:basedOn w:val="Normal"/>
-    <w:next w:val="BodyText"/>
-    <w:qFormat/>
-    <w:pPr>
-      <w:keepNext w:val="true"/>
+    <w:next w:val="Corpodetexto"/>
+    <w:qFormat/>
+    <w:pPr>
+      <w:keepNext/>
       <w:spacing w:before="240" w:after="120"/>
     </w:pPr>
     <w:rPr>
-      <w:rFonts w:ascii="Arial" w:hAnsi="Arial" w:eastAsia="SimSun" w:cs="Mangal"/>
+      <w:rFonts w:ascii="Arial" w:eastAsia="SimSun" w:hAnsi="Arial" w:cs="Mangal"/>
       <w:sz w:val="28"/>
       <w:szCs w:val="28"/>
     </w:rPr>
   </w:style>
-  <w:style w:type="paragraph" w:styleId="Legenda2" w:customStyle="1">
+  <w:style w:type="paragraph" w:customStyle="1" w:styleId="Legenda2">
     <w:name w:val="Legenda2"/>
     <w:basedOn w:val="Normal"/>
     <w:qFormat/>
@@ -2215,22 +2415,22 @@
       <w:szCs w:val="24"/>
     </w:rPr>
   </w:style>
-  <w:style w:type="paragraph" w:styleId="Ttulo1" w:customStyle="1">
+  <w:style w:type="paragraph" w:customStyle="1" w:styleId="Ttulo1">
     <w:name w:val="Título1"/>
     <w:basedOn w:val="Normal"/>
-    <w:next w:val="BodyText"/>
-    <w:qFormat/>
-    <w:pPr>
-      <w:keepNext w:val="true"/>
+    <w:next w:val="Corpodetexto"/>
+    <w:qFormat/>
+    <w:pPr>
+      <w:keepNext/>
       <w:spacing w:before="240" w:after="120"/>
     </w:pPr>
     <w:rPr>
-      <w:rFonts w:ascii="Arial" w:hAnsi="Arial" w:eastAsia="SimSun" w:cs="Mangal"/>
+      <w:rFonts w:ascii="Arial" w:eastAsia="SimSun" w:hAnsi="Arial" w:cs="Mangal"/>
       <w:sz w:val="28"/>
       <w:szCs w:val="28"/>
     </w:rPr>
   </w:style>
-  <w:style w:type="paragraph" w:styleId="Legenda1" w:customStyle="1">
+  <w:style w:type="paragraph" w:customStyle="1" w:styleId="Legenda1">
     <w:name w:val="Legenda1"/>
     <w:basedOn w:val="Normal"/>
     <w:qFormat/>
@@ -2246,12 +2446,12 @@
       <w:szCs w:val="24"/>
     </w:rPr>
   </w:style>
-  <w:style w:type="paragraph" w:styleId="TFReferencesSection" w:customStyle="1">
+  <w:style w:type="paragraph" w:customStyle="1" w:styleId="TFReferencesSection">
     <w:name w:val="TF_References_Section"/>
     <w:basedOn w:val="Normal"/>
     <w:qFormat/>
     <w:pPr>
-      <w:spacing w:lineRule="exact" w:line="170"/>
+      <w:spacing w:line="170" w:lineRule="exact"/>
       <w:ind w:firstLine="187"/>
       <w:jc w:val="both"/>
     </w:pPr>
@@ -2261,19 +2461,17 @@
       <w:szCs w:val="16"/>
     </w:rPr>
   </w:style>
-  <w:style w:type="paragraph" w:styleId="FootnoteText">
-    <w:name w:val="Footnote Text"/>
+  <w:style w:type="paragraph" w:styleId="Textodenotaderodap">
+    <w:name w:val="footnote text"/>
     <w:basedOn w:val="TFReferencesSection"/>
     <w:next w:val="TFReferencesSection"/>
-    <w:pPr/>
-    <w:rPr/>
-  </w:style>
-  <w:style w:type="paragraph" w:styleId="TAMainText" w:customStyle="1">
+  </w:style>
+  <w:style w:type="paragraph" w:customStyle="1" w:styleId="TAMainText">
     <w:name w:val="TA_Main_Text"/>
     <w:basedOn w:val="Normal"/>
     <w:qFormat/>
     <w:pPr>
-      <w:spacing w:lineRule="exact" w:line="240"/>
+      <w:spacing w:line="240" w:lineRule="exact"/>
       <w:ind w:firstLine="202"/>
       <w:jc w:val="both"/>
     </w:pPr>
@@ -2281,13 +2479,13 @@
       <w:rFonts w:ascii="Times" w:hAnsi="Times" w:cs="Times"/>
     </w:rPr>
   </w:style>
-  <w:style w:type="paragraph" w:styleId="BATitle" w:customStyle="1">
+  <w:style w:type="paragraph" w:customStyle="1" w:styleId="BATitle">
     <w:name w:val="BA_Title"/>
     <w:basedOn w:val="Normal"/>
     <w:next w:val="BBAuthorName"/>
     <w:qFormat/>
     <w:pPr>
-      <w:spacing w:lineRule="exact" w:line="480" w:before="720" w:after="240"/>
+      <w:spacing w:before="720" w:after="240" w:line="480" w:lineRule="exact"/>
       <w:ind w:right="3024"/>
     </w:pPr>
     <w:rPr>
@@ -2297,13 +2495,13 @@
       <w:szCs w:val="44"/>
     </w:rPr>
   </w:style>
-  <w:style w:type="paragraph" w:styleId="BBAuthorName" w:customStyle="1">
+  <w:style w:type="paragraph" w:customStyle="1" w:styleId="BBAuthorName">
     <w:name w:val="BB_Author_Name"/>
     <w:basedOn w:val="Normal"/>
     <w:next w:val="BCAuthorAddress"/>
     <w:qFormat/>
     <w:pPr>
-      <w:spacing w:lineRule="exact" w:line="240" w:before="0" w:after="240"/>
+      <w:spacing w:after="240" w:line="240" w:lineRule="exact"/>
       <w:ind w:right="3024"/>
     </w:pPr>
     <w:rPr>
@@ -2313,13 +2511,13 @@
       <w:szCs w:val="22"/>
     </w:rPr>
   </w:style>
-  <w:style w:type="paragraph" w:styleId="BCAuthorAddress" w:customStyle="1">
+  <w:style w:type="paragraph" w:customStyle="1" w:styleId="BCAuthorAddress">
     <w:name w:val="BC_Author_Address"/>
     <w:basedOn w:val="Normal"/>
     <w:next w:val="BIEmailAddress"/>
     <w:qFormat/>
     <w:pPr>
-      <w:spacing w:lineRule="exact" w:line="240" w:before="0" w:after="120"/>
+      <w:spacing w:after="120" w:line="240" w:lineRule="exact"/>
       <w:ind w:right="3024"/>
     </w:pPr>
     <w:rPr>
@@ -2328,37 +2526,29 @@
       <w:iCs/>
     </w:rPr>
   </w:style>
-  <w:style w:type="paragraph" w:styleId="BIEmailAddress" w:customStyle="1">
+  <w:style w:type="paragraph" w:customStyle="1" w:styleId="BIEmailAddress">
     <w:name w:val="BI_Email_Address"/>
     <w:next w:val="AIReceive03"/>
     <w:qFormat/>
     <w:pPr>
-      <w:widowControl/>
-      <w:suppressAutoHyphens w:val="true"/>
-      <w:bidi w:val="0"/>
-      <w:spacing w:lineRule="exact" w:line="240" w:before="0" w:after="120"/>
+      <w:spacing w:after="120" w:line="240" w:lineRule="exact"/>
       <w:ind w:right="3024"/>
-      <w:jc w:val="left"/>
       <w:textAlignment w:val="baseline"/>
     </w:pPr>
     <w:rPr>
-      <w:rFonts w:ascii="Times" w:hAnsi="Times" w:eastAsia="Arial" w:cs="Times"/>
+      <w:rFonts w:ascii="Times" w:eastAsia="Arial" w:hAnsi="Times" w:cs="Times"/>
       <w:i/>
       <w:iCs/>
-      <w:color w:val="auto"/>
-      <w:kern w:val="0"/>
-      <w:sz w:val="20"/>
-      <w:szCs w:val="20"/>
-      <w:lang w:val="en-US" w:eastAsia="ar-SA" w:bidi="ar-SA"/>
-    </w:rPr>
-  </w:style>
-  <w:style w:type="paragraph" w:styleId="AIReceive03" w:customStyle="1">
+      <w:lang w:val="en-US" w:eastAsia="ar-SA"/>
+    </w:rPr>
+  </w:style>
+  <w:style w:type="paragraph" w:customStyle="1" w:styleId="AIReceive03">
     <w:name w:val="AI_Receive03"/>
     <w:basedOn w:val="Normal"/>
     <w:next w:val="Absbox"/>
     <w:qFormat/>
     <w:pPr>
-      <w:spacing w:lineRule="exact" w:line="240" w:before="0" w:after="600"/>
+      <w:spacing w:after="600" w:line="240" w:lineRule="exact"/>
       <w:ind w:right="3024"/>
     </w:pPr>
     <w:rPr>
@@ -2368,32 +2558,27 @@
       <w:szCs w:val="18"/>
     </w:rPr>
   </w:style>
-  <w:style w:type="paragraph" w:styleId="BDAbstract" w:customStyle="1">
+  <w:style w:type="paragraph" w:customStyle="1" w:styleId="BDAbstract">
     <w:name w:val="BD_Abstract"/>
     <w:qFormat/>
     <w:pPr>
-      <w:widowControl/>
       <w:pBdr>
         <w:bottom w:val="single" w:sz="4" w:space="12" w:color="000000"/>
       </w:pBdr>
-      <w:suppressAutoHyphens w:val="true"/>
-      <w:bidi w:val="0"/>
-      <w:spacing w:lineRule="exact" w:line="220" w:before="200" w:after="200"/>
+      <w:spacing w:before="200" w:after="200" w:line="220" w:lineRule="exact"/>
       <w:jc w:val="both"/>
       <w:textAlignment w:val="baseline"/>
     </w:pPr>
     <w:rPr>
-      <w:rFonts w:ascii="Helvetica" w:hAnsi="Helvetica" w:eastAsia="Arial" w:cs="Helvetica"/>
+      <w:rFonts w:ascii="Helvetica" w:eastAsia="Arial" w:hAnsi="Helvetica" w:cs="Helvetica"/>
       <w:b/>
       <w:bCs/>
-      <w:color w:val="auto"/>
-      <w:kern w:val="0"/>
       <w:sz w:val="18"/>
       <w:szCs w:val="18"/>
-      <w:lang w:val="en-US" w:eastAsia="ar-SA" w:bidi="ar-SA"/>
-    </w:rPr>
-  </w:style>
-  <w:style w:type="paragraph" w:styleId="Absbox" w:customStyle="1">
+      <w:lang w:val="en-US" w:eastAsia="ar-SA"/>
+    </w:rPr>
+  </w:style>
+  <w:style w:type="paragraph" w:customStyle="1" w:styleId="Absbox">
     <w:name w:val="Absbox"/>
     <w:basedOn w:val="BDAbstract"/>
     <w:qFormat/>
@@ -2405,7 +2590,7 @@
         <w:right w:val="single" w:sz="4" w:space="4" w:color="800000"/>
       </w:pBdr>
       <w:shd w:val="clear" w:color="auto" w:fill="800000"/>
-      <w:spacing w:before="200" w:after="320"/>
+      <w:spacing w:after="320"/>
       <w:ind w:left="86" w:right="130"/>
       <w:jc w:val="center"/>
     </w:pPr>
@@ -2415,13 +2600,13 @@
       <w:szCs w:val="20"/>
     </w:rPr>
   </w:style>
-  <w:style w:type="paragraph" w:styleId="TDAcknowledgments" w:customStyle="1">
+  <w:style w:type="paragraph" w:customStyle="1" w:styleId="TDAcknowledgments">
     <w:name w:val="TD_Acknowledgments"/>
     <w:basedOn w:val="Normal"/>
     <w:next w:val="TESupportingInformation"/>
     <w:qFormat/>
     <w:pPr>
-      <w:spacing w:lineRule="exact" w:line="240" w:before="200" w:after="0"/>
+      <w:spacing w:before="200" w:line="240" w:lineRule="exact"/>
       <w:ind w:firstLine="202"/>
       <w:jc w:val="both"/>
     </w:pPr>
@@ -2429,12 +2614,12 @@
       <w:rFonts w:ascii="Times" w:hAnsi="Times" w:cs="Times"/>
     </w:rPr>
   </w:style>
-  <w:style w:type="paragraph" w:styleId="TESupportingInformation" w:customStyle="1">
+  <w:style w:type="paragraph" w:customStyle="1" w:styleId="TESupportingInformation">
     <w:name w:val="TE_Supporting_Information"/>
     <w:basedOn w:val="Normal"/>
     <w:qFormat/>
     <w:pPr>
-      <w:spacing w:lineRule="exact" w:line="240" w:before="200" w:after="0"/>
+      <w:spacing w:before="200" w:line="240" w:lineRule="exact"/>
       <w:ind w:firstLine="187"/>
       <w:jc w:val="both"/>
     </w:pPr>
@@ -2442,13 +2627,13 @@
       <w:rFonts w:ascii="Times" w:hAnsi="Times" w:cs="Times"/>
     </w:rPr>
   </w:style>
-  <w:style w:type="paragraph" w:styleId="VCSchemeTitle" w:customStyle="1">
+  <w:style w:type="paragraph" w:customStyle="1" w:styleId="VCSchemeTitle">
     <w:name w:val="VC_Scheme_Title"/>
     <w:basedOn w:val="Normal"/>
     <w:next w:val="Normal"/>
     <w:qFormat/>
     <w:pPr>
-      <w:spacing w:lineRule="exact" w:line="200" w:before="0" w:after="240"/>
+      <w:spacing w:after="240" w:line="200" w:lineRule="exact"/>
       <w:jc w:val="center"/>
     </w:pPr>
     <w:rPr>
@@ -2457,13 +2642,13 @@
       <w:szCs w:val="18"/>
     </w:rPr>
   </w:style>
-  <w:style w:type="paragraph" w:styleId="VDTableTitle" w:customStyle="1">
+  <w:style w:type="paragraph" w:customStyle="1" w:styleId="VDTableTitle">
     <w:name w:val="VD_Table_Title"/>
     <w:basedOn w:val="Normal"/>
     <w:next w:val="Normal"/>
     <w:qFormat/>
     <w:pPr>
-      <w:spacing w:lineRule="exact" w:line="200" w:before="0" w:after="240"/>
+      <w:spacing w:after="240" w:line="200" w:lineRule="exact"/>
     </w:pPr>
     <w:rPr>
       <w:rFonts w:ascii="Times" w:hAnsi="Times" w:cs="Times"/>
@@ -2471,25 +2656,25 @@
       <w:szCs w:val="18"/>
     </w:rPr>
   </w:style>
-  <w:style w:type="paragraph" w:styleId="TCScheme08" w:customStyle="1">
+  <w:style w:type="paragraph" w:customStyle="1" w:styleId="TCScheme08">
     <w:name w:val="TC_Scheme_08"/>
     <w:basedOn w:val="Normal"/>
     <w:qFormat/>
     <w:pPr>
-      <w:spacing w:lineRule="exact" w:line="194" w:before="0" w:after="211"/>
+      <w:spacing w:after="211" w:line="194" w:lineRule="exact"/>
     </w:pPr>
     <w:rPr>
       <w:sz w:val="19"/>
       <w:szCs w:val="19"/>
     </w:rPr>
   </w:style>
-  <w:style w:type="paragraph" w:styleId="VAFigureCaption" w:customStyle="1">
+  <w:style w:type="paragraph" w:customStyle="1" w:styleId="VAFigureCaption">
     <w:name w:val="VA_Figure_Caption"/>
     <w:basedOn w:val="Normal"/>
     <w:next w:val="Normal"/>
     <w:qFormat/>
     <w:pPr>
-      <w:spacing w:lineRule="exact" w:line="200" w:before="240" w:after="0"/>
+      <w:spacing w:before="240" w:line="200" w:lineRule="exact"/>
       <w:jc w:val="both"/>
     </w:pPr>
     <w:rPr>
@@ -2498,42 +2683,33 @@
       <w:szCs w:val="18"/>
     </w:rPr>
   </w:style>
-  <w:style w:type="paragraph" w:styleId="bar" w:customStyle="1">
+  <w:style w:type="paragraph" w:customStyle="1" w:styleId="bar">
     <w:name w:val="bar"/>
     <w:basedOn w:val="Normal"/>
     <w:next w:val="Normal"/>
     <w:qFormat/>
     <w:pPr>
       <w:shd w:val="clear" w:color="auto" w:fill="800000"/>
-      <w:spacing w:lineRule="exact" w:line="220" w:before="360" w:after="80"/>
-    </w:pPr>
-    <w:rPr/>
-  </w:style>
-  <w:style w:type="paragraph" w:styleId="thinbar" w:customStyle="1">
+      <w:spacing w:before="360" w:after="80" w:line="220" w:lineRule="exact"/>
+    </w:pPr>
+  </w:style>
+  <w:style w:type="paragraph" w:customStyle="1" w:styleId="thinbar">
     <w:name w:val="thinbar"/>
     <w:next w:val="TAMainText"/>
     <w:qFormat/>
     <w:pPr>
-      <w:widowControl/>
       <w:pBdr>
         <w:bottom w:val="single" w:sz="4" w:space="1" w:color="800000"/>
       </w:pBdr>
-      <w:suppressAutoHyphens w:val="true"/>
-      <w:bidi w:val="0"/>
-      <w:spacing w:lineRule="exact" w:line="20" w:before="240" w:after="300"/>
-      <w:jc w:val="left"/>
+      <w:spacing w:before="240" w:after="300" w:line="20" w:lineRule="exact"/>
       <w:textAlignment w:val="baseline"/>
     </w:pPr>
     <w:rPr>
-      <w:rFonts w:ascii="New York" w:hAnsi="New York" w:eastAsia="Arial" w:cs="New York"/>
-      <w:color w:val="auto"/>
-      <w:kern w:val="0"/>
-      <w:sz w:val="20"/>
-      <w:szCs w:val="20"/>
-      <w:lang w:val="en-US" w:eastAsia="ar-SA" w:bidi="ar-SA"/>
-    </w:rPr>
-  </w:style>
-  <w:style w:type="paragraph" w:styleId="graphicbox" w:customStyle="1">
+      <w:rFonts w:ascii="New York" w:eastAsia="Arial" w:hAnsi="New York" w:cs="New York"/>
+      <w:lang w:val="en-US" w:eastAsia="ar-SA"/>
+    </w:rPr>
+  </w:style>
+  <w:style w:type="paragraph" w:customStyle="1" w:styleId="graphicbox">
     <w:name w:val="graphicbox"/>
     <w:basedOn w:val="Normal"/>
     <w:next w:val="BDAbstract"/>
@@ -2547,12 +2723,12 @@
       <w:szCs w:val="18"/>
     </w:rPr>
   </w:style>
-  <w:style w:type="paragraph" w:styleId="FETableFootnote" w:customStyle="1">
+  <w:style w:type="paragraph" w:customStyle="1" w:styleId="FETableFootnote">
     <w:name w:val="FE_Table_Footnote"/>
     <w:basedOn w:val="Normal"/>
     <w:qFormat/>
     <w:pPr>
-      <w:spacing w:lineRule="exact" w:line="170"/>
+      <w:spacing w:line="170" w:lineRule="exact"/>
       <w:ind w:firstLine="187"/>
     </w:pPr>
     <w:rPr>
@@ -2560,35 +2736,30 @@
       <w:szCs w:val="16"/>
     </w:rPr>
   </w:style>
-  <w:style w:type="paragraph" w:styleId="FDSchemeFootnote" w:customStyle="1">
+  <w:style w:type="paragraph" w:customStyle="1" w:styleId="FDSchemeFootnote">
     <w:name w:val="FD_Scheme_Footnote"/>
     <w:basedOn w:val="Normal"/>
     <w:qFormat/>
-    <w:pPr/>
-    <w:rPr/>
-  </w:style>
-  <w:style w:type="paragraph" w:styleId="TCTableBody" w:customStyle="1">
+  </w:style>
+  <w:style w:type="paragraph" w:customStyle="1" w:styleId="TCTableBody">
     <w:name w:val="TC_Table_Body"/>
     <w:basedOn w:val="VDTableTitle"/>
     <w:qFormat/>
     <w:pPr>
       <w:jc w:val="both"/>
     </w:pPr>
-    <w:rPr/>
-  </w:style>
-  <w:style w:type="paragraph" w:styleId="EndnoteText">
-    <w:name w:val="Endnote Text"/>
-    <w:basedOn w:val="Normal"/>
-    <w:pPr/>
-    <w:rPr/>
-  </w:style>
-  <w:style w:type="paragraph" w:styleId="VBChartTitle" w:customStyle="1">
+  </w:style>
+  <w:style w:type="paragraph" w:styleId="Textodenotadefim">
+    <w:name w:val="endnote text"/>
+    <w:basedOn w:val="Normal"/>
+  </w:style>
+  <w:style w:type="paragraph" w:customStyle="1" w:styleId="VBChartTitle">
     <w:name w:val="VB_Chart_Title"/>
     <w:basedOn w:val="Normal"/>
     <w:next w:val="Normal"/>
     <w:qFormat/>
     <w:pPr>
-      <w:spacing w:lineRule="exact" w:line="200" w:before="240" w:after="0"/>
+      <w:spacing w:before="240" w:line="200" w:lineRule="exact"/>
       <w:jc w:val="both"/>
     </w:pPr>
     <w:rPr>
@@ -2597,12 +2768,12 @@
       <w:szCs w:val="19"/>
     </w:rPr>
   </w:style>
-  <w:style w:type="paragraph" w:styleId="FCChartFootnote" w:customStyle="1">
+  <w:style w:type="paragraph" w:customStyle="1" w:styleId="FCChartFootnote">
     <w:name w:val="FC_Chart_Footnote"/>
     <w:basedOn w:val="FETableFootnote"/>
     <w:qFormat/>
     <w:pPr>
-      <w:spacing w:lineRule="exact" w:line="180" w:before="120" w:after="0"/>
+      <w:spacing w:before="120" w:line="180" w:lineRule="exact"/>
       <w:jc w:val="both"/>
     </w:pPr>
     <w:rPr>
@@ -2611,53 +2782,44 @@
       <w:szCs w:val="17"/>
     </w:rPr>
   </w:style>
-  <w:style w:type="paragraph" w:styleId="CabealhoeRodap" w:customStyle="1">
+  <w:style w:type="paragraph" w:customStyle="1" w:styleId="CabealhoeRodap">
     <w:name w:val="Cabeçalho e Rodapé"/>
     <w:basedOn w:val="Normal"/>
     <w:qFormat/>
-    <w:pPr/>
-    <w:rPr/>
-  </w:style>
-  <w:style w:type="paragraph" w:styleId="Cabealhoerodap1">
+  </w:style>
+  <w:style w:type="paragraph" w:customStyle="1" w:styleId="Cabealhoerodap1">
     <w:name w:val="Cabeçalho e rodapé1"/>
     <w:basedOn w:val="Normal"/>
     <w:qFormat/>
-    <w:pPr/>
-    <w:rPr/>
-  </w:style>
-  <w:style w:type="paragraph" w:styleId="Header">
-    <w:name w:val="Header"/>
+  </w:style>
+  <w:style w:type="paragraph" w:styleId="Cabealho">
+    <w:name w:val="header"/>
     <w:basedOn w:val="Normal"/>
     <w:pPr>
       <w:tabs>
-        <w:tab w:val="clear" w:pos="720"/>
-        <w:tab w:val="center" w:pos="4320" w:leader="none"/>
-        <w:tab w:val="right" w:pos="8640" w:leader="none"/>
+        <w:tab w:val="center" w:pos="4320"/>
+        <w:tab w:val="right" w:pos="8640"/>
       </w:tabs>
     </w:pPr>
-    <w:rPr/>
-  </w:style>
-  <w:style w:type="paragraph" w:styleId="Footer">
-    <w:name w:val="Footer"/>
+  </w:style>
+  <w:style w:type="paragraph" w:styleId="Rodap">
+    <w:name w:val="footer"/>
     <w:basedOn w:val="Normal"/>
     <w:link w:val="RodapChar"/>
     <w:uiPriority w:val="99"/>
     <w:pPr>
       <w:tabs>
-        <w:tab w:val="clear" w:pos="720"/>
-        <w:tab w:val="center" w:pos="4419" w:leader="none"/>
-        <w:tab w:val="right" w:pos="8838" w:leader="none"/>
+        <w:tab w:val="center" w:pos="4419"/>
+        <w:tab w:val="right" w:pos="8838"/>
       </w:tabs>
     </w:pPr>
-    <w:rPr/>
-  </w:style>
-  <w:style w:type="paragraph" w:styleId="Ref" w:customStyle="1">
+  </w:style>
+  <w:style w:type="paragraph" w:customStyle="1" w:styleId="Ref">
     <w:name w:val="Ref"/>
     <w:basedOn w:val="Normal"/>
     <w:qFormat/>
     <w:pPr>
-      <w:overflowPunct w:val="true"/>
-      <w:spacing w:lineRule="exact" w:line="205"/>
+      <w:spacing w:line="205" w:lineRule="exact"/>
       <w:textAlignment w:val="auto"/>
     </w:pPr>
     <w:rPr>
@@ -2666,36 +2828,33 @@
       <w:sz w:val="18"/>
     </w:rPr>
   </w:style>
-  <w:style w:type="paragraph" w:styleId="BalloonText">
+  <w:style w:type="paragraph" w:styleId="Textodebalo">
     <w:name w:val="Balloon Text"/>
     <w:basedOn w:val="Normal"/>
     <w:qFormat/>
-    <w:pPr/>
     <w:rPr>
       <w:rFonts w:ascii="Tahoma" w:hAnsi="Tahoma" w:cs="Tahoma"/>
       <w:sz w:val="16"/>
       <w:szCs w:val="16"/>
     </w:rPr>
   </w:style>
-  <w:style w:type="paragraph" w:styleId="Contedodetabela" w:customStyle="1">
+  <w:style w:type="paragraph" w:customStyle="1" w:styleId="Contedodetabela">
     <w:name w:val="Conteúdo de tabela"/>
     <w:basedOn w:val="Normal"/>
     <w:qFormat/>
     <w:pPr>
       <w:suppressLineNumbers/>
     </w:pPr>
-    <w:rPr/>
-  </w:style>
-  <w:style w:type="paragraph" w:styleId="Contedodatabela" w:customStyle="1">
+  </w:style>
+  <w:style w:type="paragraph" w:customStyle="1" w:styleId="Contedodatabela">
     <w:name w:val="Conteúdo da tabela"/>
     <w:basedOn w:val="Normal"/>
     <w:qFormat/>
     <w:pPr>
       <w:suppressLineNumbers/>
     </w:pPr>
-    <w:rPr/>
-  </w:style>
-  <w:style w:type="paragraph" w:styleId="Ttulodetabela" w:customStyle="1">
+  </w:style>
+  <w:style w:type="paragraph" w:customStyle="1" w:styleId="Ttulodetabela">
     <w:name w:val="Título de tabela"/>
     <w:basedOn w:val="Contedodetabela"/>
     <w:qFormat/>
@@ -2707,19 +2866,15 @@
       <w:bCs/>
     </w:rPr>
   </w:style>
-  <w:style w:type="paragraph" w:styleId="Contedodequadro" w:customStyle="1">
+  <w:style w:type="paragraph" w:customStyle="1" w:styleId="Contedodequadro">
     <w:name w:val="Conteúdo de quadro"/>
-    <w:basedOn w:val="BodyText"/>
-    <w:qFormat/>
-    <w:pPr/>
-    <w:rPr/>
-  </w:style>
-  <w:style w:type="paragraph" w:styleId="Contedodoquadro" w:customStyle="1">
+    <w:basedOn w:val="Corpodetexto"/>
+    <w:qFormat/>
+  </w:style>
+  <w:style w:type="paragraph" w:customStyle="1" w:styleId="Contedodoquadro">
     <w:name w:val="Conteúdo do quadro"/>
-    <w:basedOn w:val="BodyText"/>
-    <w:qFormat/>
-    <w:pPr/>
-    <w:rPr/>
+    <w:basedOn w:val="Corpodetexto"/>
+    <w:qFormat/>
   </w:style>
   <w:style w:type="paragraph" w:styleId="NormalWeb">
     <w:name w:val="Normal (Web)"/>
@@ -2729,9 +2884,8 @@
     <w:qFormat/>
     <w:rsid w:val="00887976"/>
     <w:pPr>
-      <w:suppressAutoHyphens w:val="false"/>
-      <w:overflowPunct w:val="true"/>
-      <w:spacing w:lineRule="auto" w:line="288" w:beforeAutospacing="1" w:after="142"/>
+      <w:suppressAutoHyphens w:val="0"/>
+      <w:spacing w:beforeAutospacing="1" w:after="142" w:line="288" w:lineRule="auto"/>
       <w:textAlignment w:val="auto"/>
     </w:pPr>
     <w:rPr>
@@ -2741,39 +2895,18 @@
       <w:lang w:val="pt-BR" w:eastAsia="pt-BR"/>
     </w:rPr>
   </w:style>
-  <w:style w:type="numbering" w:styleId="Semlista" w:default="1">
-    <w:name w:val="Sem lista"/>
-    <w:uiPriority w:val="99"/>
-    <w:semiHidden/>
-    <w:unhideWhenUsed/>
-    <w:qFormat/>
-  </w:style>
-  <w:style w:type="table" w:default="1" w:styleId="Tabelanormal">
-    <w:name w:val="Normal Table"/>
-    <w:uiPriority w:val="99"/>
-    <w:semiHidden/>
-    <w:unhideWhenUsed/>
-    <w:tblPr>
-      <w:tblCellMar>
-        <w:top w:w="0" w:type="dxa"/>
-        <w:left w:w="108" w:type="dxa"/>
-        <w:bottom w:w="0" w:type="dxa"/>
-        <w:right w:w="108" w:type="dxa"/>
-      </w:tblCellMar>
-    </w:tblPr>
-  </w:style>
   <w:style w:type="table" w:styleId="Tabelacomgrade">
     <w:name w:val="Table Grid"/>
     <w:basedOn w:val="Tabelanormal"/>
-    <w:rsid w:val="008f5fb4"/>
+    <w:rsid w:val="008F5FB4"/>
     <w:tblPr>
       <w:tblBorders>
-        <w:top w:val="single" w:color="auto" w:sz="4" w:space="0"/>
-        <w:left w:val="single" w:color="auto" w:sz="4" w:space="0"/>
-        <w:bottom w:val="single" w:color="auto" w:sz="4" w:space="0"/>
-        <w:right w:val="single" w:color="auto" w:sz="4" w:space="0"/>
-        <w:insideH w:val="single" w:color="auto" w:sz="4" w:space="0"/>
-        <w:insideV w:val="single" w:color="auto" w:sz="4" w:space="0"/>
+        <w:top w:val="single" w:sz="4" w:space="0" w:color="auto"/>
+        <w:left w:val="single" w:sz="4" w:space="0" w:color="auto"/>
+        <w:bottom w:val="single" w:sz="4" w:space="0" w:color="auto"/>
+        <w:right w:val="single" w:sz="4" w:space="0" w:color="auto"/>
+        <w:insideH w:val="single" w:sz="4" w:space="0" w:color="auto"/>
+        <w:insideV w:val="single" w:sz="4" w:space="0" w:color="auto"/>
       </w:tblBorders>
     </w:tblPr>
   </w:style>
@@ -2781,41 +2914,41 @@
 </file>
 
 <file path=word/theme/theme1.xml><?xml version="1.0" encoding="utf-8"?>
-<a:theme xmlns:a="http://schemas.openxmlformats.org/drawingml/2006/main" xmlns:r="http://schemas.openxmlformats.org/officeDocument/2006/relationships" name="Tema do Office">
+<a:theme xmlns:a="http://schemas.openxmlformats.org/drawingml/2006/main" name="Tema do Office">
   <a:themeElements>
     <a:clrScheme name="Escritório">
       <a:dk1>
         <a:srgbClr val="000000"/>
       </a:dk1>
       <a:lt1>
-        <a:srgbClr val="ffffff"/>
+        <a:srgbClr val="FFFFFF"/>
       </a:lt1>
       <a:dk2>
-        <a:srgbClr val="1f497d"/>
+        <a:srgbClr val="1F497D"/>
       </a:dk2>
       <a:lt2>
-        <a:srgbClr val="eeece1"/>
+        <a:srgbClr val="EEECE1"/>
       </a:lt2>
       <a:accent1>
-        <a:srgbClr val="4f81bd"/>
+        <a:srgbClr val="4F81BD"/>
       </a:accent1>
       <a:accent2>
-        <a:srgbClr val="c0504d"/>
+        <a:srgbClr val="C0504D"/>
       </a:accent2>
       <a:accent3>
-        <a:srgbClr val="9bbb59"/>
+        <a:srgbClr val="9BBB59"/>
       </a:accent3>
       <a:accent4>
-        <a:srgbClr val="8064a2"/>
+        <a:srgbClr val="8064A2"/>
       </a:accent4>
       <a:accent5>
-        <a:srgbClr val="4bacc6"/>
+        <a:srgbClr val="4BACC6"/>
       </a:accent5>
       <a:accent6>
-        <a:srgbClr val="f79646"/>
+        <a:srgbClr val="F79646"/>
       </a:accent6>
       <a:hlink>
-        <a:srgbClr val="0000ff"/>
+        <a:srgbClr val="0000FF"/>
       </a:hlink>
       <a:folHlink>
         <a:srgbClr val="800080"/>
@@ -2823,12 +2956,12 @@
     </a:clrScheme>
     <a:fontScheme name="Escritório">
       <a:majorFont>
-        <a:latin typeface="Cambria" pitchFamily="0" charset="1"/>
+        <a:latin typeface="Cambria"/>
         <a:ea typeface=""/>
         <a:cs typeface=""/>
       </a:majorFont>
       <a:minorFont>
-        <a:latin typeface="Calibri" pitchFamily="0" charset="1"/>
+        <a:latin typeface="Calibri"/>
         <a:ea typeface=""/>
         <a:cs typeface=""/>
       </a:minorFont>
@@ -2857,7 +2990,7 @@
             </a:gs>
           </a:gsLst>
           <a:lin ang="16200000" scaled="1"/>
-          <a:tileRect l="0" t="0" r="0" b="0"/>
+          <a:tileRect/>
         </a:gradFill>
         <a:gradFill>
           <a:gsLst>
@@ -2878,7 +3011,7 @@
             </a:gs>
           </a:gsLst>
           <a:lin ang="16200000" scaled="0"/>
-          <a:tileRect l="0" t="0" r="0" b="0"/>
+          <a:tileRect/>
         </a:gradFill>
       </a:fillStyleLst>
       <a:lnStyleLst>
@@ -2929,7 +3062,7 @@
           <a:path path="circle">
             <a:fillToRect l="50000" t="-80000" r="50000" b="180000"/>
           </a:path>
-          <a:tileRect l="0" t="0" r="0" b="0"/>
+          <a:tileRect/>
         </a:gradFill>
         <a:gradFill>
           <a:gsLst>
@@ -2947,11 +3080,13 @@
           <a:path path="circle">
             <a:fillToRect l="50000" t="50000" r="50000" b="50000"/>
           </a:path>
-          <a:tileRect l="0" t="0" r="0" b="0"/>
+          <a:tileRect/>
         </a:gradFill>
       </a:bgFillStyleLst>
     </a:fmtScheme>
   </a:themeElements>
+  <a:objectDefaults/>
+  <a:extraClrSchemeLst/>
 </a:theme>
 </file>
 

</xml_diff>